<commit_message>
paper: add GARCH(1,1) baseline row to Tables 1-2 (same masked panel/floor); shorten title; plainer DM wording; drop residual union-of-dates in md
GARCH computed on the identical deterministic masked panel (basis guard: HAR-X QLIKE matches stored). GARCH is worse than HAR on all 5 metrics at every horizon/panel (QLIKE ~0.79 vs ~0.51-0.64, negative R2, DM p<0.001 favoring HAR). Metrics written into result.json under metrics['GARCH'].

Co-Authored-By: Claude Opus 4.8 (1M context) <noreply@anthropic.com>
</commit_message>
<xml_diff>
--- a/docs/paper/soict_paper_complete.docx
+++ b/docs/paper/soict_paper_complete.docx
@@ -2,13 +2,13 @@
 <file path=word/document.xml><?xml version="1.0" encoding="utf-8"?>
 <w:document xmlns:w="http://schemas.openxmlformats.org/wordprocessingml/2006/main" xmlns:m="http://schemas.openxmlformats.org/officeDocument/2006/math" xmlns:r="http://schemas.openxmlformats.org/officeDocument/2006/relationships" xmlns:o="urn:schemas-microsoft-com:office:office" xmlns:v="urn:schemas-microsoft-com:vml" xmlns:w10="urn:schemas-microsoft-com:office:word" xmlns:a="http://schemas.openxmlformats.org/drawingml/2006/main" xmlns:pic="http://schemas.openxmlformats.org/drawingml/2006/picture" xmlns:wp="http://schemas.openxmlformats.org/drawingml/2006/wordprocessingDrawing">
   <w:body>
-    <w:bookmarkStart w:id="27" w:name="X43ecc4b397bff4094d0874016d8ef94e06477b2"/>
+    <w:bookmarkStart w:id="27" w:name="Xba1d549e648012001271c6119321cf99675df6b"/>
     <w:p>
       <w:pPr>
         <w:pStyle w:val="Heading1"/>
       </w:pPr>
       <w:r>
-        <w:t xml:space="preserve">Multi-Horizon Stock Volatility Forecasting: HAR, LSTM and Graph-Attention Models on Vietnamese Equities</w:t>
+        <w:t xml:space="preserve">Multi-Horizon Stock Volatility Forecasting</w:t>
       </w:r>
     </w:p>
     <w:p>
@@ -319,7 +319,7 @@
           <w:b/>
           <w:bCs/>
         </w:rPr>
-        <w:t xml:space="preserve">masked union-of-dates panel</w:t>
+        <w:t xml:space="preserve">masked panel</w:t>
       </w:r>
       <w:r>
         <w:t xml:space="preserve">: rather than intersecting to the dates on which every</w:t>
@@ -348,7 +348,7 @@
         <w:pStyle w:val="BodyText"/>
       </w:pPr>
       <w:r>
-        <w:t xml:space="preserve">Our contributions are: (i) a multi-horizon benchmark on the masked union-of-dates VN30/VN100 panel that holds</w:t>
+        <w:t xml:space="preserve">Our contributions are: (i) a multi-horizon benchmark on the masked VN30/VN100 panel that holds</w:t>
       </w:r>
       <w:r>
         <w:t xml:space="preserve"> </w:t>
@@ -455,7 +455,7 @@
         <w:t xml:space="preserve"> </w:t>
       </w:r>
       <w:r>
-        <w:t xml:space="preserve">remain standard conditional-variance benchmarks. We use HAR as the linear baseline.</w:t>
+        <w:t xml:space="preserve">remain standard conditional-variance benchmarks. We use HAR as the linear baseline and GARCH(1,1) as a classical benchmark.</w:t>
       </w:r>
     </w:p>
     <w:p>
@@ -663,7 +663,7 @@
         <w:t xml:space="preserve"> </w:t>
       </w:r>
       <w:r>
-        <w:t xml:space="preserve">study. All three models use the same five node features per ticker at day</w:t>
+        <w:t xml:space="preserve">study. All three feature-based models (HAR, LSTM, LSTM+GAT) use the same five node features per ticker at day</w:t>
       </w:r>
       <w:r>
         <w:t xml:space="preserve"> </w:t>
@@ -864,6 +864,25 @@
       </w:r>
       <w:r>
         <w:t xml:space="preserve">isolates the graph’s marginal contribution.</w:t>
+      </w:r>
+    </w:p>
+    <w:p>
+      <w:pPr>
+        <w:pStyle w:val="Compact"/>
+        <w:numPr>
+          <w:ilvl w:val="0"/>
+          <w:numId w:val="1002"/>
+        </w:numPr>
+      </w:pPr>
+      <w:r>
+        <w:rPr>
+          <w:b/>
+          <w:bCs/>
+        </w:rPr>
+        <w:t xml:space="preserve">GARCH(1,1)</w:t>
+      </w:r>
+      <w:r>
+        <w:t xml:space="preserve">: a conditional-variance model fit per ticker on the training Parkinson-variance series (via pseudo-returns), a classical benchmark that forecasts the variance series directly and does not use the node features.</w:t>
       </w:r>
     </w:p>
     <w:p>
@@ -962,13 +981,13 @@
       </w:r>
     </w:p>
     <w:bookmarkEnd w:id="16"/>
-    <w:bookmarkStart w:id="17" w:name="masked-union-of-dates-panel"/>
+    <w:bookmarkStart w:id="17" w:name="masked-panel"/>
     <w:p>
       <w:pPr>
         <w:pStyle w:val="Heading3"/>
       </w:pPr>
       <w:r>
-        <w:t xml:space="preserve">3.3 Masked union-of-dates panel</w:t>
+        <w:t xml:space="preserve">3.3 Masked panel</w:t>
       </w:r>
     </w:p>
     <w:p>
@@ -998,7 +1017,7 @@
           <w:b/>
           <w:bCs/>
         </w:rPr>
-        <w:t xml:space="preserve">masked union-of-dates panel</w:t>
+        <w:t xml:space="preserve">masked panel</w:t>
       </w:r>
       <w:r>
         <w:t xml:space="preserve">: the GAT operates over a common-date</w:t>
@@ -1465,7 +1484,7 @@
         <w:t xml:space="preserve">results/masked_rich_floor1e2/</w:t>
       </w:r>
       <w:r>
-        <w:t xml:space="preserve">). Row order is HAR → LSTM → LSTM+GAT.</w:t>
+        <w:t xml:space="preserve">). Row order is HAR → GARCH → LSTM → LSTM+GAT.</w:t>
       </w:r>
     </w:p>
     <w:p>
@@ -1752,6 +1771,90 @@
               <w:pStyle w:val="Compact"/>
             </w:pPr>
             <w:r>
+              <w:t xml:space="preserve">GARCH</w:t>
+            </w:r>
+          </w:p>
+        </w:tc>
+        <w:tc>
+          <w:tcPr/>
+          <w:p>
+            <w:pPr>
+              <w:pStyle w:val="Compact"/>
+              <w:jc w:val="right"/>
+            </w:pPr>
+            <w:r>
+              <w:t xml:space="preserve">5.917</w:t>
+            </w:r>
+          </w:p>
+        </w:tc>
+        <w:tc>
+          <w:tcPr/>
+          <w:p>
+            <w:pPr>
+              <w:pStyle w:val="Compact"/>
+              <w:jc w:val="right"/>
+            </w:pPr>
+            <w:r>
+              <w:t xml:space="preserve">7.692</w:t>
+            </w:r>
+          </w:p>
+        </w:tc>
+        <w:tc>
+          <w:tcPr/>
+          <w:p>
+            <w:pPr>
+              <w:pStyle w:val="Compact"/>
+              <w:jc w:val="right"/>
+            </w:pPr>
+            <w:r>
+              <w:t xml:space="preserve">5.195</w:t>
+            </w:r>
+          </w:p>
+        </w:tc>
+        <w:tc>
+          <w:tcPr/>
+          <w:p>
+            <w:pPr>
+              <w:pStyle w:val="Compact"/>
+              <w:jc w:val="right"/>
+            </w:pPr>
+            <w:r>
+              <w:t xml:space="preserve">0.7964</w:t>
+            </w:r>
+          </w:p>
+        </w:tc>
+        <w:tc>
+          <w:tcPr/>
+          <w:p>
+            <w:pPr>
+              <w:pStyle w:val="Compact"/>
+              <w:jc w:val="right"/>
+            </w:pPr>
+            <w:r>
+              <w:t xml:space="preserve">-0.9407</w:t>
+            </w:r>
+          </w:p>
+        </w:tc>
+      </w:tr>
+      <w:tr>
+        <w:tc>
+          <w:tcPr/>
+          <w:p>
+            <w:pPr>
+              <w:pStyle w:val="Compact"/>
+            </w:pPr>
+            <w:r>
+              <w:t xml:space="preserve">1</w:t>
+            </w:r>
+          </w:p>
+        </w:tc>
+        <w:tc>
+          <w:tcPr/>
+          <w:p>
+            <w:pPr>
+              <w:pStyle w:val="Compact"/>
+            </w:pPr>
+            <w:r>
               <w:t xml:space="preserve">LSTM</w:t>
             </w:r>
           </w:p>
@@ -2040,6 +2143,90 @@
               <w:pStyle w:val="Compact"/>
             </w:pPr>
             <w:r>
+              <w:t xml:space="preserve">GARCH</w:t>
+            </w:r>
+          </w:p>
+        </w:tc>
+        <w:tc>
+          <w:tcPr/>
+          <w:p>
+            <w:pPr>
+              <w:pStyle w:val="Compact"/>
+              <w:jc w:val="right"/>
+            </w:pPr>
+            <w:r>
+              <w:t xml:space="preserve">5.843</w:t>
+            </w:r>
+          </w:p>
+        </w:tc>
+        <w:tc>
+          <w:tcPr/>
+          <w:p>
+            <w:pPr>
+              <w:pStyle w:val="Compact"/>
+              <w:jc w:val="right"/>
+            </w:pPr>
+            <w:r>
+              <w:t xml:space="preserve">7.644</w:t>
+            </w:r>
+          </w:p>
+        </w:tc>
+        <w:tc>
+          <w:tcPr/>
+          <w:p>
+            <w:pPr>
+              <w:pStyle w:val="Compact"/>
+              <w:jc w:val="right"/>
+            </w:pPr>
+            <w:r>
+              <w:t xml:space="preserve">5.197</w:t>
+            </w:r>
+          </w:p>
+        </w:tc>
+        <w:tc>
+          <w:tcPr/>
+          <w:p>
+            <w:pPr>
+              <w:pStyle w:val="Compact"/>
+              <w:jc w:val="right"/>
+            </w:pPr>
+            <w:r>
+              <w:t xml:space="preserve">0.7865</w:t>
+            </w:r>
+          </w:p>
+        </w:tc>
+        <w:tc>
+          <w:tcPr/>
+          <w:p>
+            <w:pPr>
+              <w:pStyle w:val="Compact"/>
+              <w:jc w:val="right"/>
+            </w:pPr>
+            <w:r>
+              <w:t xml:space="preserve">-0.9136</w:t>
+            </w:r>
+          </w:p>
+        </w:tc>
+      </w:tr>
+      <w:tr>
+        <w:tc>
+          <w:tcPr/>
+          <w:p>
+            <w:pPr>
+              <w:pStyle w:val="Compact"/>
+            </w:pPr>
+            <w:r>
+              <w:t xml:space="preserve">5</w:t>
+            </w:r>
+          </w:p>
+        </w:tc>
+        <w:tc>
+          <w:tcPr/>
+          <w:p>
+            <w:pPr>
+              <w:pStyle w:val="Compact"/>
+            </w:pPr>
+            <w:r>
               <w:t xml:space="preserve">LSTM</w:t>
             </w:r>
           </w:p>
@@ -2312,6 +2499,90 @@
               <w:pStyle w:val="Compact"/>
             </w:pPr>
             <w:r>
+              <w:t xml:space="preserve">GARCH</w:t>
+            </w:r>
+          </w:p>
+        </w:tc>
+        <w:tc>
+          <w:tcPr/>
+          <w:p>
+            <w:pPr>
+              <w:pStyle w:val="Compact"/>
+              <w:jc w:val="right"/>
+            </w:pPr>
+            <w:r>
+              <w:t xml:space="preserve">6.399</w:t>
+            </w:r>
+          </w:p>
+        </w:tc>
+        <w:tc>
+          <w:tcPr/>
+          <w:p>
+            <w:pPr>
+              <w:pStyle w:val="Compact"/>
+              <w:jc w:val="right"/>
+            </w:pPr>
+            <w:r>
+              <w:t xml:space="preserve">7.999</w:t>
+            </w:r>
+          </w:p>
+        </w:tc>
+        <w:tc>
+          <w:tcPr/>
+          <w:p>
+            <w:pPr>
+              <w:pStyle w:val="Compact"/>
+              <w:jc w:val="right"/>
+            </w:pPr>
+            <w:r>
+              <w:t xml:space="preserve">5.306</w:t>
+            </w:r>
+          </w:p>
+        </w:tc>
+        <w:tc>
+          <w:tcPr/>
+          <w:p>
+            <w:pPr>
+              <w:pStyle w:val="Compact"/>
+              <w:jc w:val="right"/>
+            </w:pPr>
+            <w:r>
+              <w:t xml:space="preserve">0.8018</w:t>
+            </w:r>
+          </w:p>
+        </w:tc>
+        <w:tc>
+          <w:tcPr/>
+          <w:p>
+            <w:pPr>
+              <w:pStyle w:val="Compact"/>
+              <w:jc w:val="right"/>
+            </w:pPr>
+            <w:r>
+              <w:t xml:space="preserve">-1.0957</w:t>
+            </w:r>
+          </w:p>
+        </w:tc>
+      </w:tr>
+      <w:tr>
+        <w:tc>
+          <w:tcPr/>
+          <w:p>
+            <w:pPr>
+              <w:pStyle w:val="Compact"/>
+            </w:pPr>
+            <w:r>
+              <w:t xml:space="preserve">10</w:t>
+            </w:r>
+          </w:p>
+        </w:tc>
+        <w:tc>
+          <w:tcPr/>
+          <w:p>
+            <w:pPr>
+              <w:pStyle w:val="Compact"/>
+            </w:pPr>
+            <w:r>
               <w:t xml:space="preserve">LSTM</w:t>
             </w:r>
           </w:p>
@@ -2561,6 +2832,90 @@
                 <w:bCs/>
               </w:rPr>
               <w:t xml:space="preserve">0.0544</w:t>
+            </w:r>
+          </w:p>
+        </w:tc>
+      </w:tr>
+      <w:tr>
+        <w:tc>
+          <w:tcPr/>
+          <w:p>
+            <w:pPr>
+              <w:pStyle w:val="Compact"/>
+            </w:pPr>
+            <w:r>
+              <w:t xml:space="preserve">22</w:t>
+            </w:r>
+          </w:p>
+        </w:tc>
+        <w:tc>
+          <w:tcPr/>
+          <w:p>
+            <w:pPr>
+              <w:pStyle w:val="Compact"/>
+            </w:pPr>
+            <w:r>
+              <w:t xml:space="preserve">GARCH</w:t>
+            </w:r>
+          </w:p>
+        </w:tc>
+        <w:tc>
+          <w:tcPr/>
+          <w:p>
+            <w:pPr>
+              <w:pStyle w:val="Compact"/>
+              <w:jc w:val="right"/>
+            </w:pPr>
+            <w:r>
+              <w:t xml:space="preserve">7.089</w:t>
+            </w:r>
+          </w:p>
+        </w:tc>
+        <w:tc>
+          <w:tcPr/>
+          <w:p>
+            <w:pPr>
+              <w:pStyle w:val="Compact"/>
+              <w:jc w:val="right"/>
+            </w:pPr>
+            <w:r>
+              <w:t xml:space="preserve">8.420</w:t>
+            </w:r>
+          </w:p>
+        </w:tc>
+        <w:tc>
+          <w:tcPr/>
+          <w:p>
+            <w:pPr>
+              <w:pStyle w:val="Compact"/>
+              <w:jc w:val="right"/>
+            </w:pPr>
+            <w:r>
+              <w:t xml:space="preserve">5.360</w:t>
+            </w:r>
+          </w:p>
+        </w:tc>
+        <w:tc>
+          <w:tcPr/>
+          <w:p>
+            <w:pPr>
+              <w:pStyle w:val="Compact"/>
+              <w:jc w:val="right"/>
+            </w:pPr>
+            <w:r>
+              <w:t xml:space="preserve">0.7928</w:t>
+            </w:r>
+          </w:p>
+        </w:tc>
+        <w:tc>
+          <w:tcPr/>
+          <w:p>
+            <w:pPr>
+              <w:pStyle w:val="Compact"/>
+              <w:jc w:val="right"/>
+            </w:pPr>
+            <w:r>
+              <w:t xml:space="preserve">-1.3184</w:t>
             </w:r>
           </w:p>
         </w:tc>
@@ -2966,6 +3321,90 @@
               <w:pStyle w:val="Compact"/>
             </w:pPr>
             <w:r>
+              <w:t xml:space="preserve">GARCH</w:t>
+            </w:r>
+          </w:p>
+        </w:tc>
+        <w:tc>
+          <w:tcPr/>
+          <w:p>
+            <w:pPr>
+              <w:pStyle w:val="Compact"/>
+              <w:jc w:val="right"/>
+            </w:pPr>
+            <w:r>
+              <w:t xml:space="preserve">2.770</w:t>
+            </w:r>
+          </w:p>
+        </w:tc>
+        <w:tc>
+          <w:tcPr/>
+          <w:p>
+            <w:pPr>
+              <w:pStyle w:val="Compact"/>
+              <w:jc w:val="right"/>
+            </w:pPr>
+            <w:r>
+              <w:t xml:space="preserve">5.263</w:t>
+            </w:r>
+          </w:p>
+        </w:tc>
+        <w:tc>
+          <w:tcPr/>
+          <w:p>
+            <w:pPr>
+              <w:pStyle w:val="Compact"/>
+              <w:jc w:val="right"/>
+            </w:pPr>
+            <w:r>
+              <w:t xml:space="preserve">3.453</w:t>
+            </w:r>
+          </w:p>
+        </w:tc>
+        <w:tc>
+          <w:tcPr/>
+          <w:p>
+            <w:pPr>
+              <w:pStyle w:val="Compact"/>
+              <w:jc w:val="right"/>
+            </w:pPr>
+            <w:r>
+              <w:t xml:space="preserve">0.7911</w:t>
+            </w:r>
+          </w:p>
+        </w:tc>
+        <w:tc>
+          <w:tcPr/>
+          <w:p>
+            <w:pPr>
+              <w:pStyle w:val="Compact"/>
+              <w:jc w:val="right"/>
+            </w:pPr>
+            <w:r>
+              <w:t xml:space="preserve">-0.1060</w:t>
+            </w:r>
+          </w:p>
+        </w:tc>
+      </w:tr>
+      <w:tr>
+        <w:tc>
+          <w:tcPr/>
+          <w:p>
+            <w:pPr>
+              <w:pStyle w:val="Compact"/>
+            </w:pPr>
+            <w:r>
+              <w:t xml:space="preserve">1</w:t>
+            </w:r>
+          </w:p>
+        </w:tc>
+        <w:tc>
+          <w:tcPr/>
+          <w:p>
+            <w:pPr>
+              <w:pStyle w:val="Compact"/>
+            </w:pPr>
+            <w:r>
               <w:t xml:space="preserve">LSTM</w:t>
             </w:r>
           </w:p>
@@ -3254,6 +3693,90 @@
               <w:pStyle w:val="Compact"/>
             </w:pPr>
             <w:r>
+              <w:t xml:space="preserve">GARCH</w:t>
+            </w:r>
+          </w:p>
+        </w:tc>
+        <w:tc>
+          <w:tcPr/>
+          <w:p>
+            <w:pPr>
+              <w:pStyle w:val="Compact"/>
+              <w:jc w:val="right"/>
+            </w:pPr>
+            <w:r>
+              <w:t xml:space="preserve">2.785</w:t>
+            </w:r>
+          </w:p>
+        </w:tc>
+        <w:tc>
+          <w:tcPr/>
+          <w:p>
+            <w:pPr>
+              <w:pStyle w:val="Compact"/>
+              <w:jc w:val="right"/>
+            </w:pPr>
+            <w:r>
+              <w:t xml:space="preserve">5.277</w:t>
+            </w:r>
+          </w:p>
+        </w:tc>
+        <w:tc>
+          <w:tcPr/>
+          <w:p>
+            <w:pPr>
+              <w:pStyle w:val="Compact"/>
+              <w:jc w:val="right"/>
+            </w:pPr>
+            <w:r>
+              <w:t xml:space="preserve">3.492</w:t>
+            </w:r>
+          </w:p>
+        </w:tc>
+        <w:tc>
+          <w:tcPr/>
+          <w:p>
+            <w:pPr>
+              <w:pStyle w:val="Compact"/>
+              <w:jc w:val="right"/>
+            </w:pPr>
+            <w:r>
+              <w:t xml:space="preserve">0.7864</w:t>
+            </w:r>
+          </w:p>
+        </w:tc>
+        <w:tc>
+          <w:tcPr/>
+          <w:p>
+            <w:pPr>
+              <w:pStyle w:val="Compact"/>
+              <w:jc w:val="right"/>
+            </w:pPr>
+            <w:r>
+              <w:t xml:space="preserve">-0.1071</w:t>
+            </w:r>
+          </w:p>
+        </w:tc>
+      </w:tr>
+      <w:tr>
+        <w:tc>
+          <w:tcPr/>
+          <w:p>
+            <w:pPr>
+              <w:pStyle w:val="Compact"/>
+            </w:pPr>
+            <w:r>
+              <w:t xml:space="preserve">5</w:t>
+            </w:r>
+          </w:p>
+        </w:tc>
+        <w:tc>
+          <w:tcPr/>
+          <w:p>
+            <w:pPr>
+              <w:pStyle w:val="Compact"/>
+            </w:pPr>
+            <w:r>
               <w:t xml:space="preserve">LSTM</w:t>
             </w:r>
           </w:p>
@@ -3522,6 +4045,90 @@
               <w:pStyle w:val="Compact"/>
             </w:pPr>
             <w:r>
+              <w:t xml:space="preserve">GARCH</w:t>
+            </w:r>
+          </w:p>
+        </w:tc>
+        <w:tc>
+          <w:tcPr/>
+          <w:p>
+            <w:pPr>
+              <w:pStyle w:val="Compact"/>
+              <w:jc w:val="right"/>
+            </w:pPr>
+            <w:r>
+              <w:t xml:space="preserve">2.835</w:t>
+            </w:r>
+          </w:p>
+        </w:tc>
+        <w:tc>
+          <w:tcPr/>
+          <w:p>
+            <w:pPr>
+              <w:pStyle w:val="Compact"/>
+              <w:jc w:val="right"/>
+            </w:pPr>
+            <w:r>
+              <w:t xml:space="preserve">5.324</w:t>
+            </w:r>
+          </w:p>
+        </w:tc>
+        <w:tc>
+          <w:tcPr/>
+          <w:p>
+            <w:pPr>
+              <w:pStyle w:val="Compact"/>
+              <w:jc w:val="right"/>
+            </w:pPr>
+            <w:r>
+              <w:t xml:space="preserve">3.503</w:t>
+            </w:r>
+          </w:p>
+        </w:tc>
+        <w:tc>
+          <w:tcPr/>
+          <w:p>
+            <w:pPr>
+              <w:pStyle w:val="Compact"/>
+              <w:jc w:val="right"/>
+            </w:pPr>
+            <w:r>
+              <w:t xml:space="preserve">0.7791</w:t>
+            </w:r>
+          </w:p>
+        </w:tc>
+        <w:tc>
+          <w:tcPr/>
+          <w:p>
+            <w:pPr>
+              <w:pStyle w:val="Compact"/>
+              <w:jc w:val="right"/>
+            </w:pPr>
+            <w:r>
+              <w:t xml:space="preserve">-0.1052</w:t>
+            </w:r>
+          </w:p>
+        </w:tc>
+      </w:tr>
+      <w:tr>
+        <w:tc>
+          <w:tcPr/>
+          <w:p>
+            <w:pPr>
+              <w:pStyle w:val="Compact"/>
+            </w:pPr>
+            <w:r>
+              <w:t xml:space="preserve">10</w:t>
+            </w:r>
+          </w:p>
+        </w:tc>
+        <w:tc>
+          <w:tcPr/>
+          <w:p>
+            <w:pPr>
+              <w:pStyle w:val="Compact"/>
+            </w:pPr>
+            <w:r>
               <w:t xml:space="preserve">LSTM</w:t>
             </w:r>
           </w:p>
@@ -3775,6 +4382,90 @@
                 <w:bCs/>
               </w:rPr>
               <w:t xml:space="preserve">0.0723</w:t>
+            </w:r>
+          </w:p>
+        </w:tc>
+      </w:tr>
+      <w:tr>
+        <w:tc>
+          <w:tcPr/>
+          <w:p>
+            <w:pPr>
+              <w:pStyle w:val="Compact"/>
+            </w:pPr>
+            <w:r>
+              <w:t xml:space="preserve">22</w:t>
+            </w:r>
+          </w:p>
+        </w:tc>
+        <w:tc>
+          <w:tcPr/>
+          <w:p>
+            <w:pPr>
+              <w:pStyle w:val="Compact"/>
+            </w:pPr>
+            <w:r>
+              <w:t xml:space="preserve">GARCH</w:t>
+            </w:r>
+          </w:p>
+        </w:tc>
+        <w:tc>
+          <w:tcPr/>
+          <w:p>
+            <w:pPr>
+              <w:pStyle w:val="Compact"/>
+              <w:jc w:val="right"/>
+            </w:pPr>
+            <w:r>
+              <w:t xml:space="preserve">2.709</w:t>
+            </w:r>
+          </w:p>
+        </w:tc>
+        <w:tc>
+          <w:tcPr/>
+          <w:p>
+            <w:pPr>
+              <w:pStyle w:val="Compact"/>
+              <w:jc w:val="right"/>
+            </w:pPr>
+            <w:r>
+              <w:t xml:space="preserve">5.205</w:t>
+            </w:r>
+          </w:p>
+        </w:tc>
+        <w:tc>
+          <w:tcPr/>
+          <w:p>
+            <w:pPr>
+              <w:pStyle w:val="Compact"/>
+              <w:jc w:val="right"/>
+            </w:pPr>
+            <w:r>
+              <w:t xml:space="preserve">3.413</w:t>
+            </w:r>
+          </w:p>
+        </w:tc>
+        <w:tc>
+          <w:tcPr/>
+          <w:p>
+            <w:pPr>
+              <w:pStyle w:val="Compact"/>
+              <w:jc w:val="right"/>
+            </w:pPr>
+            <w:r>
+              <w:t xml:space="preserve">0.7445</w:t>
+            </w:r>
+          </w:p>
+        </w:tc>
+        <w:tc>
+          <w:tcPr/>
+          <w:p>
+            <w:pPr>
+              <w:pStyle w:val="Compact"/>
+              <w:jc w:val="right"/>
+            </w:pPr>
+            <w:r>
+              <w:t xml:space="preserve">-0.1064</w:t>
             </w:r>
           </w:p>
         </w:tc>
@@ -4864,6 +5555,22 @@
       <w:r>
         <w:t xml:space="preserve">h10 (p=0.022) and h22 (p=0.002) and a higher MAE than HAR at VN30 h22 (p=0.001).</w:t>
       </w:r>
+      <w:r>
+        <w:t xml:space="preserve"> </w:t>
+      </w:r>
+      <w:r>
+        <w:rPr>
+          <w:b/>
+          <w:bCs/>
+        </w:rPr>
+        <w:t xml:space="preserve">GARCH benchmark.</w:t>
+      </w:r>
+      <w:r>
+        <w:t xml:space="preserve"> </w:t>
+      </w:r>
+      <w:r>
+        <w:t xml:space="preserve">GARCH(1,1) has a higher MSE, RMSE, MAE and QLIKE and a lower (negative) R² than HAR at every horizon on both panels; its QLIKE is higher than HAR’s under the date-clustered DM test in all eight cells (p&lt;0.001, except VN30 h22 where p=0.001).</w:t>
+      </w:r>
     </w:p>
     <w:p>
       <w:r>
@@ -5120,7 +5827,7 @@
         <w:t xml:space="preserve"> </w:t>
       </w:r>
       <w:r>
-        <w:t xml:space="preserve">masked union-of-dates panel and the same date-clustered Diebold–Mariano inference, HAR has the lowest QLIKE at</w:t>
+        <w:t xml:space="preserve">masked panel and the same date-clustered Diebold–Mariano inference, HAR has the lowest QLIKE at</w:t>
       </w:r>
       <w:r>
         <w:t xml:space="preserve"> </w:t>

</xml_diff>

<commit_message>
fig1: correct + compact architecture diagram (5 node features, directed vol->Parkinson weighted 2-hop, h=1,5,10,22)
Old figure wrongly showed a graphical-lasso/partial-corr graph, 3 HAR features and h=1,5. Redrawn to match the delivered/paper model; text no longer overflows boxes; svg.fonttype=none for searchable labels. Test guards labels (5 node features / vol->Parkinson / 2-hop present; no graphical-lasso/partial-corr).

Co-Authored-By: Claude Opus 4.8 (1M context) <noreply@anthropic.com>
</commit_message>
<xml_diff>
--- a/docs/paper/soict_paper_complete.docx
+++ b/docs/paper/soict_paper_complete.docx
@@ -892,7 +892,7 @@
       <w:r>
         <w:drawing>
           <wp:inline>
-            <wp:extent cx="5334000" cy="2041722"/>
+            <wp:extent cx="5334000" cy="1955709"/>
             <wp:effectExtent b="0" l="0" r="0" t="0"/>
             <wp:docPr descr="Figure 1: HAR-LSTM-GAT architecture" title="" id="14" name="Picture"/>
             <a:graphic>
@@ -913,7 +913,7 @@
                   <pic:spPr bwMode="auto">
                     <a:xfrm>
                       <a:off x="0" y="0"/>
-                      <a:ext cx="5334000" cy="2041722"/>
+                      <a:ext cx="5334000" cy="1955709"/>
                     </a:xfrm>
                     <a:prstGeom prst="rect">
                       <a:avLst/>

</xml_diff>

<commit_message>
fig1: widen boxes (+0.5) so text has margin; keep correct model description
Co-Authored-By: Claude Opus 4.8 (1M context) <noreply@anthropic.com>
</commit_message>
<xml_diff>
--- a/docs/paper/soict_paper_complete.docx
+++ b/docs/paper/soict_paper_complete.docx
@@ -892,7 +892,7 @@
       <w:r>
         <w:drawing>
           <wp:inline>
-            <wp:extent cx="5334000" cy="1955709"/>
+            <wp:extent cx="5334000" cy="1831492"/>
             <wp:effectExtent b="0" l="0" r="0" t="0"/>
             <wp:docPr descr="Figure 1: HAR-LSTM-GAT architecture" title="" id="14" name="Picture"/>
             <a:graphic>
@@ -913,7 +913,7 @@
                   <pic:spPr bwMode="auto">
                     <a:xfrm>
                       <a:off x="0" y="0"/>
-                      <a:ext cx="5334000" cy="1955709"/>
+                      <a:ext cx="5334000" cy="1831492"/>
                     </a:xfrm>
                     <a:prstGeom prst="rect">
                       <a:avLst/>

</xml_diff>

<commit_message>
paper: remove Limitations section (per user); Conclusion renumbered to 8
Co-Authored-By: Claude Opus 4.8 (1M context) <noreply@anthropic.com>
</commit_message>
<xml_diff>
--- a/docs/paper/soict_paper_complete.docx
+++ b/docs/paper/soict_paper_complete.docx
@@ -2,7 +2,7 @@
 <file path=word/document.xml><?xml version="1.0" encoding="utf-8"?>
 <w:document xmlns:w="http://schemas.openxmlformats.org/wordprocessingml/2006/main" xmlns:m="http://schemas.openxmlformats.org/officeDocument/2006/math" xmlns:r="http://schemas.openxmlformats.org/officeDocument/2006/relationships" xmlns:o="urn:schemas-microsoft-com:office:office" xmlns:v="urn:schemas-microsoft-com:vml" xmlns:w10="urn:schemas-microsoft-com:office:word" xmlns:a="http://schemas.openxmlformats.org/drawingml/2006/main" xmlns:pic="http://schemas.openxmlformats.org/drawingml/2006/picture" xmlns:wp="http://schemas.openxmlformats.org/drawingml/2006/wordprocessingDrawing">
   <w:body>
-    <w:bookmarkStart w:id="27" w:name="Xba1d549e648012001271c6119321cf99675df6b"/>
+    <w:bookmarkStart w:id="26" w:name="Xba1d549e648012001271c6119321cf99675df6b"/>
     <w:p>
       <w:pPr>
         <w:pStyle w:val="Heading1"/>
@@ -5679,13 +5679,80 @@
       </w:r>
     </w:p>
     <w:bookmarkEnd w:id="23"/>
-    <w:bookmarkStart w:id="24" w:name="limitations"/>
+    <w:bookmarkStart w:id="24" w:name="conclusion"/>
     <w:p>
       <w:pPr>
         <w:pStyle w:val="Heading2"/>
       </w:pPr>
       <w:r>
-        <w:t xml:space="preserve">8. Limitations</w:t>
+        <w:t xml:space="preserve">8. Conclusion</w:t>
+      </w:r>
+    </w:p>
+    <w:p>
+      <w:pPr>
+        <w:pStyle w:val="FirstParagraph"/>
+      </w:pPr>
+      <w:r>
+        <w:t xml:space="preserve">For daily Parkinson-variance forecasting on the Vietnamese market, evaluated with the same features, the same</w:t>
+      </w:r>
+      <w:r>
+        <w:t xml:space="preserve"> </w:t>
+      </w:r>
+      <w:r>
+        <w:t xml:space="preserve">masked panel and the same date-clustered Diebold–Mariano inference, HAR has the lowest QLIKE at</w:t>
+      </w:r>
+      <w:r>
+        <w:t xml:space="preserve"> </w:t>
+      </w:r>
+      <w:r>
+        <w:t xml:space="preserve">every horizon on both panels and no learned model has a significantly lower QLIKE than HAR. At the short</w:t>
+      </w:r>
+      <w:r>
+        <w:t xml:space="preserve"> </w:t>
+      </w:r>
+      <w:r>
+        <w:t xml:space="preserve">horizons (h1, h5) the LSTM and LSTM+GAT have the lowest MAE on VN100, and the directed volume→Parkinson</w:t>
+      </w:r>
+      <w:r>
+        <w:t xml:space="preserve"> </w:t>
+      </w:r>
+      <w:r>
+        <w:t xml:space="preserve">weighted graph gives the LSTM+GAT a significantly lower QLIKE than the same-feature no-graph LSTM in both</w:t>
+      </w:r>
+      <w:r>
+        <w:t xml:space="preserve"> </w:t>
+      </w:r>
+      <w:r>
+        <w:t xml:space="preserve">panels, equal to HAR’s QLIKE level at VN100 h5; at the extended horizons (h10, h22) HAR has the lowest MSE,</w:t>
+      </w:r>
+      <w:r>
+        <w:t xml:space="preserve"> </w:t>
+      </w:r>
+      <w:r>
+        <w:t xml:space="preserve">RMSE, QLIKE and R², and the graph’s QLIKE difference from the no-graph LSTM is not significant. The ranking is</w:t>
+      </w:r>
+      <w:r>
+        <w:t xml:space="preserve"> </w:t>
+      </w:r>
+      <w:r>
+        <w:t xml:space="preserve">metric- and horizon-dependent, so all five metrics are reported with equal weight.</w:t>
+      </w:r>
+    </w:p>
+    <w:p>
+      <w:r>
+        <w:pict>
+          <v:rect style="width:0;height:1.5pt" o:hralign="center" o:hrstd="t" o:hr="t"/>
+        </w:pict>
+      </w:r>
+    </w:p>
+    <w:bookmarkEnd w:id="24"/>
+    <w:bookmarkStart w:id="25" w:name="references"/>
+    <w:p>
+      <w:pPr>
+        <w:pStyle w:val="Heading2"/>
+      </w:pPr>
+      <w:r>
+        <w:t xml:space="preserve">References</w:t>
       </w:r>
     </w:p>
     <w:p>
@@ -5697,29 +5764,34 @@
         </w:numPr>
       </w:pPr>
       <w:r>
+        <w:t xml:space="preserve">Corsi, F. (2009). A simple approximate long-memory model of realized volatility.</w:t>
+      </w:r>
+      <w:r>
+        <w:t xml:space="preserve"> </w:t>
+      </w:r>
+      <w:r>
         <w:rPr>
-          <w:b/>
-          <w:bCs/>
+          <w:i/>
+          <w:iCs/>
         </w:rPr>
-        <w:t xml:space="preserve">Positivity floor.</w:t>
-      </w:r>
-      <w:r>
-        <w:t xml:space="preserve"> </w:t>
-      </w:r>
-      <w:r>
-        <w:t xml:space="preserve">QLIKE at the short horizons depends on the per-node prediction floor; we fix a common</w:t>
-      </w:r>
-      <w:r>
-        <w:t xml:space="preserve"> </w:t>
-      </w:r>
-      <w:r>
-        <w:t xml:space="preserve">floor (1e-2 times the per-node training mean) across all models and report MSE, RMSE, MAE and R² alongside</w:t>
-      </w:r>
-      <w:r>
-        <w:t xml:space="preserve"> </w:t>
-      </w:r>
-      <w:r>
-        <w:t xml:space="preserve">QLIKE.</w:t>
+        <w:t xml:space="preserve">Journal of Financial</w:t>
+      </w:r>
+      <w:r>
+        <w:rPr>
+          <w:i/>
+          <w:iCs/>
+        </w:rPr>
+        <w:t xml:space="preserve"> </w:t>
+      </w:r>
+      <w:r>
+        <w:rPr>
+          <w:i/>
+          <w:iCs/>
+        </w:rPr>
+        <w:t xml:space="preserve">Econometrics</w:t>
+      </w:r>
+      <w:r>
+        <w:t xml:space="preserve">, 7(2), 174–196.</w:t>
       </w:r>
     </w:p>
     <w:p>
@@ -5731,17 +5803,20 @@
         </w:numPr>
       </w:pPr>
       <w:r>
+        <w:t xml:space="preserve">Parkinson, M. (1980). The extreme value method for estimating the variance of the rate of return.</w:t>
+      </w:r>
+      <w:r>
+        <w:t xml:space="preserve"> </w:t>
+      </w:r>
+      <w:r>
         <w:rPr>
-          <w:b/>
-          <w:bCs/>
+          <w:i/>
+          <w:iCs/>
         </w:rPr>
-        <w:t xml:space="preserve">Single market.</w:t>
-      </w:r>
-      <w:r>
-        <w:t xml:space="preserve"> </w:t>
-      </w:r>
-      <w:r>
-        <w:t xml:space="preserve">The study covers the Vietnamese market (VN30, VN100).</w:t>
+        <w:t xml:space="preserve">The Journal of Business</w:t>
+      </w:r>
+      <w:r>
+        <w:t xml:space="preserve">, 53(1), 61–65.</w:t>
       </w:r>
     </w:p>
     <w:p>
@@ -5753,23 +5828,20 @@
         </w:numPr>
       </w:pPr>
       <w:r>
+        <w:t xml:space="preserve">Hochreiter, S., &amp; Schmidhuber, J. (1997). Long short-term memory.</w:t>
+      </w:r>
+      <w:r>
+        <w:t xml:space="preserve"> </w:t>
+      </w:r>
+      <w:r>
         <w:rPr>
-          <w:b/>
-          <w:bCs/>
+          <w:i/>
+          <w:iCs/>
         </w:rPr>
-        <w:t xml:space="preserve">Graph scope.</w:t>
-      </w:r>
-      <w:r>
-        <w:t xml:space="preserve"> </w:t>
-      </w:r>
-      <w:r>
-        <w:t xml:space="preserve">The study uses a directed volume→Parkinson weighted graph; other graph designs (for</w:t>
-      </w:r>
-      <w:r>
-        <w:t xml:space="preserve"> </w:t>
-      </w:r>
-      <w:r>
-        <w:t xml:space="preserve">example volume-shock-threshold or sector graphs) were not tested and remain follow-up work.</w:t>
+        <w:t xml:space="preserve">Neural Computation</w:t>
+      </w:r>
+      <w:r>
+        <w:t xml:space="preserve">, 9(8), 1735–1780.</w:t>
       </w:r>
     </w:p>
     <w:p>
@@ -5781,118 +5853,13 @@
         </w:numPr>
       </w:pPr>
       <w:r>
-        <w:t xml:space="preserve">All reported numbers are read directly from stored</w:t>
-      </w:r>
-      <w:r>
-        <w:t xml:space="preserve"> </w:t>
-      </w:r>
-      <w:r>
-        <w:rPr>
-          <w:rStyle w:val="VerbatimChar"/>
-        </w:rPr>
-        <w:t xml:space="preserve">result.json</w:t>
-      </w:r>
-      <w:r>
-        <w:t xml:space="preserve"> </w:t>
-      </w:r>
-      <w:r>
-        <w:t xml:space="preserve">files.</w:t>
-      </w:r>
-    </w:p>
-    <w:p>
-      <w:r>
-        <w:pict>
-          <v:rect style="width:0;height:1.5pt" o:hralign="center" o:hrstd="t" o:hr="t"/>
-        </w:pict>
-      </w:r>
-    </w:p>
-    <w:bookmarkEnd w:id="24"/>
-    <w:bookmarkStart w:id="25" w:name="conclusion"/>
-    <w:p>
-      <w:pPr>
-        <w:pStyle w:val="Heading2"/>
-      </w:pPr>
-      <w:r>
-        <w:t xml:space="preserve">9. Conclusion</w:t>
-      </w:r>
-    </w:p>
-    <w:p>
-      <w:pPr>
-        <w:pStyle w:val="FirstParagraph"/>
-      </w:pPr>
-      <w:r>
-        <w:t xml:space="preserve">For daily Parkinson-variance forecasting on the Vietnamese market, evaluated with the same features, the same</w:t>
-      </w:r>
-      <w:r>
-        <w:t xml:space="preserve"> </w:t>
-      </w:r>
-      <w:r>
-        <w:t xml:space="preserve">masked panel and the same date-clustered Diebold–Mariano inference, HAR has the lowest QLIKE at</w:t>
-      </w:r>
-      <w:r>
-        <w:t xml:space="preserve"> </w:t>
-      </w:r>
-      <w:r>
-        <w:t xml:space="preserve">every horizon on both panels and no learned model has a significantly lower QLIKE than HAR. At the short</w:t>
-      </w:r>
-      <w:r>
-        <w:t xml:space="preserve"> </w:t>
-      </w:r>
-      <w:r>
-        <w:t xml:space="preserve">horizons (h1, h5) the LSTM and LSTM+GAT have the lowest MAE on VN100, and the directed volume→Parkinson</w:t>
-      </w:r>
-      <w:r>
-        <w:t xml:space="preserve"> </w:t>
-      </w:r>
-      <w:r>
-        <w:t xml:space="preserve">weighted graph gives the LSTM+GAT a significantly lower QLIKE than the same-feature no-graph LSTM in both</w:t>
-      </w:r>
-      <w:r>
-        <w:t xml:space="preserve"> </w:t>
-      </w:r>
-      <w:r>
-        <w:t xml:space="preserve">panels, equal to HAR’s QLIKE level at VN100 h5; at the extended horizons (h10, h22) HAR has the lowest MSE,</w:t>
-      </w:r>
-      <w:r>
-        <w:t xml:space="preserve"> </w:t>
-      </w:r>
-      <w:r>
-        <w:t xml:space="preserve">RMSE, QLIKE and R², and the graph’s QLIKE difference from the no-graph LSTM is not significant. The ranking is</w:t>
-      </w:r>
-      <w:r>
-        <w:t xml:space="preserve"> </w:t>
-      </w:r>
-      <w:r>
-        <w:t xml:space="preserve">metric- and horizon-dependent, so all five metrics are reported with equal weight.</w:t>
-      </w:r>
-    </w:p>
-    <w:p>
-      <w:r>
-        <w:pict>
-          <v:rect style="width:0;height:1.5pt" o:hralign="center" o:hrstd="t" o:hr="t"/>
-        </w:pict>
-      </w:r>
-    </w:p>
-    <w:bookmarkEnd w:id="25"/>
-    <w:bookmarkStart w:id="26" w:name="references"/>
-    <w:p>
-      <w:pPr>
-        <w:pStyle w:val="Heading2"/>
-      </w:pPr>
-      <w:r>
-        <w:t xml:space="preserve">References</w:t>
-      </w:r>
-    </w:p>
-    <w:p>
-      <w:pPr>
-        <w:pStyle w:val="Compact"/>
-        <w:numPr>
-          <w:ilvl w:val="0"/>
-          <w:numId w:val="1005"/>
-        </w:numPr>
-      </w:pPr>
-      <w:r>
-        <w:t xml:space="preserve">Corsi, F. (2009). A simple approximate long-memory model of realized volatility.</w:t>
+        <w:t xml:space="preserve">Veličković, P., Cucurull, G., Casanova, A., Romero, A., Liò, P., &amp; Bengio, Y. (2018). Graph attention</w:t>
+      </w:r>
+      <w:r>
+        <w:t xml:space="preserve"> </w:t>
+      </w:r>
+      <w:r>
+        <w:t xml:space="preserve">networks. In</w:t>
       </w:r>
       <w:r>
         <w:t xml:space="preserve"> </w:t>
@@ -5902,7 +5869,96 @@
           <w:i/>
           <w:iCs/>
         </w:rPr>
-        <w:t xml:space="preserve">Journal of Financial</w:t>
+        <w:t xml:space="preserve">International Conference on Learning Representations (ICLR)</w:t>
+      </w:r>
+      <w:r>
+        <w:t xml:space="preserve">.</w:t>
+      </w:r>
+    </w:p>
+    <w:p>
+      <w:pPr>
+        <w:pStyle w:val="Compact"/>
+        <w:numPr>
+          <w:ilvl w:val="0"/>
+          <w:numId w:val="1004"/>
+        </w:numPr>
+      </w:pPr>
+      <w:r>
+        <w:t xml:space="preserve">Diebold, F. X., &amp; Mariano, R. S. (1995). Comparing predictive accuracy.</w:t>
+      </w:r>
+      <w:r>
+        <w:t xml:space="preserve"> </w:t>
+      </w:r>
+      <w:r>
+        <w:rPr>
+          <w:i/>
+          <w:iCs/>
+        </w:rPr>
+        <w:t xml:space="preserve">Journal of Business &amp; Economic</w:t>
+      </w:r>
+      <w:r>
+        <w:rPr>
+          <w:i/>
+          <w:iCs/>
+        </w:rPr>
+        <w:t xml:space="preserve"> </w:t>
+      </w:r>
+      <w:r>
+        <w:rPr>
+          <w:i/>
+          <w:iCs/>
+        </w:rPr>
+        <w:t xml:space="preserve">Statistics</w:t>
+      </w:r>
+      <w:r>
+        <w:t xml:space="preserve">, 13(3), 253–263.</w:t>
+      </w:r>
+    </w:p>
+    <w:p>
+      <w:pPr>
+        <w:pStyle w:val="Compact"/>
+        <w:numPr>
+          <w:ilvl w:val="0"/>
+          <w:numId w:val="1004"/>
+        </w:numPr>
+      </w:pPr>
+      <w:r>
+        <w:t xml:space="preserve">Harvey, D., Leybourne, S., &amp; Newbold, P. (1997). Testing the equality of prediction mean squared errors.</w:t>
+      </w:r>
+      <w:r>
+        <w:t xml:space="preserve"> </w:t>
+      </w:r>
+      <w:r>
+        <w:rPr>
+          <w:i/>
+          <w:iCs/>
+        </w:rPr>
+        <w:t xml:space="preserve">International Journal of Forecasting</w:t>
+      </w:r>
+      <w:r>
+        <w:t xml:space="preserve">, 13(2), 281–291.</w:t>
+      </w:r>
+    </w:p>
+    <w:p>
+      <w:pPr>
+        <w:pStyle w:val="Compact"/>
+        <w:numPr>
+          <w:ilvl w:val="0"/>
+          <w:numId w:val="1004"/>
+        </w:numPr>
+      </w:pPr>
+      <w:r>
+        <w:t xml:space="preserve">Patton, A. J. (2011). Volatility forecast comparison using imperfect volatility proxies.</w:t>
+      </w:r>
+      <w:r>
+        <w:t xml:space="preserve"> </w:t>
+      </w:r>
+      <w:r>
+        <w:rPr>
+          <w:i/>
+          <w:iCs/>
+        </w:rPr>
+        <w:t xml:space="preserve">Journal of</w:t>
       </w:r>
       <w:r>
         <w:rPr>
@@ -5919,7 +5975,7 @@
         <w:t xml:space="preserve">Econometrics</w:t>
       </w:r>
       <w:r>
-        <w:t xml:space="preserve">, 7(2), 174–196.</w:t>
+        <w:t xml:space="preserve">, 160(1), 246–256.</w:t>
       </w:r>
     </w:p>
     <w:p>
@@ -5927,11 +5983,17 @@
         <w:pStyle w:val="Compact"/>
         <w:numPr>
           <w:ilvl w:val="0"/>
-          <w:numId w:val="1005"/>
+          <w:numId w:val="1004"/>
         </w:numPr>
       </w:pPr>
       <w:r>
-        <w:t xml:space="preserve">Parkinson, M. (1980). The extreme value method for estimating the variance of the rate of return.</w:t>
+        <w:t xml:space="preserve">Bollerslev, T., Patton, A. J., &amp; Quaedvlieg, R. (2016). Exploiting the errors: a simple approach for</w:t>
+      </w:r>
+      <w:r>
+        <w:t xml:space="preserve"> </w:t>
+      </w:r>
+      <w:r>
+        <w:t xml:space="preserve">improved volatility forecasting (HARQ).</w:t>
       </w:r>
       <w:r>
         <w:t xml:space="preserve"> </w:t>
@@ -5941,10 +6003,10 @@
           <w:i/>
           <w:iCs/>
         </w:rPr>
-        <w:t xml:space="preserve">The Journal of Business</w:t>
-      </w:r>
-      <w:r>
-        <w:t xml:space="preserve">, 53(1), 61–65.</w:t>
+        <w:t xml:space="preserve">Journal of Econometrics</w:t>
+      </w:r>
+      <w:r>
+        <w:t xml:space="preserve">, 192(1), 1–18.</w:t>
       </w:r>
     </w:p>
     <w:p>
@@ -5952,106 +6014,17 @@
         <w:pStyle w:val="Compact"/>
         <w:numPr>
           <w:ilvl w:val="0"/>
-          <w:numId w:val="1005"/>
+          <w:numId w:val="1004"/>
         </w:numPr>
       </w:pPr>
       <w:r>
-        <w:t xml:space="preserve">Hochreiter, S., &amp; Schmidhuber, J. (1997). Long short-term memory.</w:t>
-      </w:r>
-      <w:r>
-        <w:t xml:space="preserve"> </w:t>
-      </w:r>
-      <w:r>
-        <w:rPr>
-          <w:i/>
-          <w:iCs/>
-        </w:rPr>
-        <w:t xml:space="preserve">Neural Computation</w:t>
-      </w:r>
-      <w:r>
-        <w:t xml:space="preserve">, 9(8), 1735–1780.</w:t>
-      </w:r>
-    </w:p>
-    <w:p>
-      <w:pPr>
-        <w:pStyle w:val="Compact"/>
-        <w:numPr>
-          <w:ilvl w:val="0"/>
-          <w:numId w:val="1005"/>
-        </w:numPr>
-      </w:pPr>
-      <w:r>
-        <w:t xml:space="preserve">Veličković, P., Cucurull, G., Casanova, A., Romero, A., Liò, P., &amp; Bengio, Y. (2018). Graph attention</w:t>
-      </w:r>
-      <w:r>
-        <w:t xml:space="preserve"> </w:t>
-      </w:r>
-      <w:r>
-        <w:t xml:space="preserve">networks. In</w:t>
-      </w:r>
-      <w:r>
-        <w:t xml:space="preserve"> </w:t>
-      </w:r>
-      <w:r>
-        <w:rPr>
-          <w:i/>
-          <w:iCs/>
-        </w:rPr>
-        <w:t xml:space="preserve">International Conference on Learning Representations (ICLR)</w:t>
-      </w:r>
-      <w:r>
-        <w:t xml:space="preserve">.</w:t>
-      </w:r>
-    </w:p>
-    <w:p>
-      <w:pPr>
-        <w:pStyle w:val="Compact"/>
-        <w:numPr>
-          <w:ilvl w:val="0"/>
-          <w:numId w:val="1005"/>
-        </w:numPr>
-      </w:pPr>
-      <w:r>
-        <w:t xml:space="preserve">Diebold, F. X., &amp; Mariano, R. S. (1995). Comparing predictive accuracy.</w:t>
-      </w:r>
-      <w:r>
-        <w:t xml:space="preserve"> </w:t>
-      </w:r>
-      <w:r>
-        <w:rPr>
-          <w:i/>
-          <w:iCs/>
-        </w:rPr>
-        <w:t xml:space="preserve">Journal of Business &amp; Economic</w:t>
-      </w:r>
-      <w:r>
-        <w:rPr>
-          <w:i/>
-          <w:iCs/>
-        </w:rPr>
-        <w:t xml:space="preserve"> </w:t>
-      </w:r>
-      <w:r>
-        <w:rPr>
-          <w:i/>
-          <w:iCs/>
-        </w:rPr>
-        <w:t xml:space="preserve">Statistics</w:t>
-      </w:r>
-      <w:r>
-        <w:t xml:space="preserve">, 13(3), 253–263.</w:t>
-      </w:r>
-    </w:p>
-    <w:p>
-      <w:pPr>
-        <w:pStyle w:val="Compact"/>
-        <w:numPr>
-          <w:ilvl w:val="0"/>
-          <w:numId w:val="1005"/>
-        </w:numPr>
-      </w:pPr>
-      <w:r>
-        <w:t xml:space="preserve">Harvey, D., Leybourne, S., &amp; Newbold, P. (1997). Testing the equality of prediction mean squared errors.</w:t>
+        <w:t xml:space="preserve">Diebold, F. X., &amp; Yilmaz, K. (2012). Better to give than to receive: predictive directional measurement</w:t>
+      </w:r>
+      <w:r>
+        <w:t xml:space="preserve"> </w:t>
+      </w:r>
+      <w:r>
+        <w:t xml:space="preserve">of volatility spillovers.</w:t>
       </w:r>
       <w:r>
         <w:t xml:space="preserve"> </w:t>
@@ -6064,7 +6037,7 @@
         <w:t xml:space="preserve">International Journal of Forecasting</w:t>
       </w:r>
       <w:r>
-        <w:t xml:space="preserve">, 13(2), 281–291.</w:t>
+        <w:t xml:space="preserve">, 28(1), 57–66.</w:t>
       </w:r>
     </w:p>
     <w:p>
@@ -6072,108 +6045,7 @@
         <w:pStyle w:val="Compact"/>
         <w:numPr>
           <w:ilvl w:val="0"/>
-          <w:numId w:val="1005"/>
-        </w:numPr>
-      </w:pPr>
-      <w:r>
-        <w:t xml:space="preserve">Patton, A. J. (2011). Volatility forecast comparison using imperfect volatility proxies.</w:t>
-      </w:r>
-      <w:r>
-        <w:t xml:space="preserve"> </w:t>
-      </w:r>
-      <w:r>
-        <w:rPr>
-          <w:i/>
-          <w:iCs/>
-        </w:rPr>
-        <w:t xml:space="preserve">Journal of</w:t>
-      </w:r>
-      <w:r>
-        <w:rPr>
-          <w:i/>
-          <w:iCs/>
-        </w:rPr>
-        <w:t xml:space="preserve"> </w:t>
-      </w:r>
-      <w:r>
-        <w:rPr>
-          <w:i/>
-          <w:iCs/>
-        </w:rPr>
-        <w:t xml:space="preserve">Econometrics</w:t>
-      </w:r>
-      <w:r>
-        <w:t xml:space="preserve">, 160(1), 246–256.</w:t>
-      </w:r>
-    </w:p>
-    <w:p>
-      <w:pPr>
-        <w:pStyle w:val="Compact"/>
-        <w:numPr>
-          <w:ilvl w:val="0"/>
-          <w:numId w:val="1005"/>
-        </w:numPr>
-      </w:pPr>
-      <w:r>
-        <w:t xml:space="preserve">Bollerslev, T., Patton, A. J., &amp; Quaedvlieg, R. (2016). Exploiting the errors: a simple approach for</w:t>
-      </w:r>
-      <w:r>
-        <w:t xml:space="preserve"> </w:t>
-      </w:r>
-      <w:r>
-        <w:t xml:space="preserve">improved volatility forecasting (HARQ).</w:t>
-      </w:r>
-      <w:r>
-        <w:t xml:space="preserve"> </w:t>
-      </w:r>
-      <w:r>
-        <w:rPr>
-          <w:i/>
-          <w:iCs/>
-        </w:rPr>
-        <w:t xml:space="preserve">Journal of Econometrics</w:t>
-      </w:r>
-      <w:r>
-        <w:t xml:space="preserve">, 192(1), 1–18.</w:t>
-      </w:r>
-    </w:p>
-    <w:p>
-      <w:pPr>
-        <w:pStyle w:val="Compact"/>
-        <w:numPr>
-          <w:ilvl w:val="0"/>
-          <w:numId w:val="1005"/>
-        </w:numPr>
-      </w:pPr>
-      <w:r>
-        <w:t xml:space="preserve">Diebold, F. X., &amp; Yilmaz, K. (2012). Better to give than to receive: predictive directional measurement</w:t>
-      </w:r>
-      <w:r>
-        <w:t xml:space="preserve"> </w:t>
-      </w:r>
-      <w:r>
-        <w:t xml:space="preserve">of volatility spillovers.</w:t>
-      </w:r>
-      <w:r>
-        <w:t xml:space="preserve"> </w:t>
-      </w:r>
-      <w:r>
-        <w:rPr>
-          <w:i/>
-          <w:iCs/>
-        </w:rPr>
-        <w:t xml:space="preserve">International Journal of Forecasting</w:t>
-      </w:r>
-      <w:r>
-        <w:t xml:space="preserve">, 28(1), 57–66.</w:t>
-      </w:r>
-    </w:p>
-    <w:p>
-      <w:pPr>
-        <w:pStyle w:val="Compact"/>
-        <w:numPr>
-          <w:ilvl w:val="0"/>
-          <w:numId w:val="1005"/>
+          <w:numId w:val="1004"/>
         </w:numPr>
       </w:pPr>
       <w:r>
@@ -6204,7 +6076,7 @@
         <w:pStyle w:val="Compact"/>
         <w:numPr>
           <w:ilvl w:val="0"/>
-          <w:numId w:val="1005"/>
+          <w:numId w:val="1004"/>
         </w:numPr>
       </w:pPr>
       <w:r>
@@ -6222,7 +6094,7 @@
         <w:pStyle w:val="Compact"/>
         <w:numPr>
           <w:ilvl w:val="0"/>
-          <w:numId w:val="1005"/>
+          <w:numId w:val="1004"/>
         </w:numPr>
       </w:pPr>
       <w:r>
@@ -6325,8 +6197,8 @@
         <w:t xml:space="preserve">.</w:t>
       </w:r>
     </w:p>
+    <w:bookmarkEnd w:id="25"/>
     <w:bookmarkEnd w:id="26"/>
-    <w:bookmarkEnd w:id="27"/>
     <w:sectPr>
       <w:footnotePr>
         <w:numRestart w:val="eachSect"/>
@@ -6665,9 +6537,6 @@
     <w:abstractNumId w:val="991"/>
   </w:num>
   <w:num w:numId="1004">
-    <w:abstractNumId w:val="991"/>
-  </w:num>
-  <w:num w:numId="1005">
     <w:abstractNumId w:val="99411"/>
     <w:lvlOverride w:ilvl="0">
       <w:startOverride w:val="1"/>

</xml_diff>

<commit_message>
tables 1-2: mark (dagger) metrics where LSTM+GAT improves over the no-graph LSTM + legend
Co-Authored-By: Claude Opus 4.8 (1M context) <noreply@anthropic.com>
</commit_message>
<xml_diff>
--- a/docs/paper/soict_paper_complete.docx
+++ b/docs/paper/soict_paper_complete.docx
@@ -1562,7 +1562,7 @@
         <w:t xml:space="preserve"> </w:t>
       </w:r>
       <w:r>
-        <w:t xml:space="preserve">MSE/RMSE/MAE/QLIKE, higher for R².</w:t>
+        <w:t xml:space="preserve">MSE/RMSE/MAE/QLIKE, higher for R². † marks metrics where LSTM+GAT improves over the no-graph LSTM.</w:t>
       </w:r>
     </w:p>
     <w:tbl>
@@ -1957,6 +1957,9 @@
               </w:rPr>
               <w:t xml:space="preserve">2.362</w:t>
             </w:r>
+            <w:r>
+              <w:t xml:space="preserve">†</w:t>
+            </w:r>
           </w:p>
         </w:tc>
         <w:tc>
@@ -1973,6 +1976,9 @@
               </w:rPr>
               <w:t xml:space="preserve">4.860</w:t>
             </w:r>
+            <w:r>
+              <w:t xml:space="preserve">†</w:t>
+            </w:r>
           </w:p>
         </w:tc>
         <w:tc>
@@ -1989,6 +1995,9 @@
               </w:rPr>
               <w:t xml:space="preserve">2.819</w:t>
             </w:r>
+            <w:r>
+              <w:t xml:space="preserve">†</w:t>
+            </w:r>
           </w:p>
         </w:tc>
         <w:tc>
@@ -2005,6 +2014,9 @@
               </w:rPr>
               <w:t xml:space="preserve">0.5107</w:t>
             </w:r>
+            <w:r>
+              <w:t xml:space="preserve">†</w:t>
+            </w:r>
           </w:p>
         </w:tc>
         <w:tc>
@@ -2021,6 +2033,9 @@
               </w:rPr>
               <w:t xml:space="preserve">0.2251</w:t>
             </w:r>
+            <w:r>
+              <w:t xml:space="preserve">†</w:t>
+            </w:r>
           </w:p>
         </w:tc>
       </w:tr>
@@ -2327,19 +2342,19 @@
               <w:jc w:val="right"/>
             </w:pPr>
             <w:r>
-              <w:t xml:space="preserve">2.635</w:t>
-            </w:r>
-          </w:p>
-        </w:tc>
-        <w:tc>
-          <w:tcPr/>
-          <w:p>
-            <w:pPr>
-              <w:pStyle w:val="Compact"/>
-              <w:jc w:val="right"/>
-            </w:pPr>
-            <w:r>
-              <w:t xml:space="preserve">5.133</w:t>
+              <w:t xml:space="preserve">2.635†</w:t>
+            </w:r>
+          </w:p>
+        </w:tc>
+        <w:tc>
+          <w:tcPr/>
+          <w:p>
+            <w:pPr>
+              <w:pStyle w:val="Compact"/>
+              <w:jc w:val="right"/>
+            </w:pPr>
+            <w:r>
+              <w:t xml:space="preserve">5.133†</w:t>
             </w:r>
           </w:p>
         </w:tc>
@@ -2363,19 +2378,19 @@
               <w:jc w:val="right"/>
             </w:pPr>
             <w:r>
-              <w:t xml:space="preserve">0.5690</w:t>
-            </w:r>
-          </w:p>
-        </w:tc>
-        <w:tc>
-          <w:tcPr/>
-          <w:p>
-            <w:pPr>
-              <w:pStyle w:val="Compact"/>
-              <w:jc w:val="right"/>
-            </w:pPr>
-            <w:r>
-              <w:t xml:space="preserve">0.1371</w:t>
+              <w:t xml:space="preserve">0.5690†</w:t>
+            </w:r>
+          </w:p>
+        </w:tc>
+        <w:tc>
+          <w:tcPr/>
+          <w:p>
+            <w:pPr>
+              <w:pStyle w:val="Compact"/>
+              <w:jc w:val="right"/>
+            </w:pPr>
+            <w:r>
+              <w:t xml:space="preserve">0.1371†</w:t>
             </w:r>
           </w:p>
         </w:tc>
@@ -2708,6 +2723,9 @@
                 <w:bCs/>
               </w:rPr>
               <w:t xml:space="preserve">3.276</w:t>
+            </w:r>
+            <w:r>
+              <w:t xml:space="preserve">†</w:t>
             </w:r>
           </w:p>
         </w:tc>
@@ -3507,6 +3525,9 @@
               </w:rPr>
               <w:t xml:space="preserve">1.912</w:t>
             </w:r>
+            <w:r>
+              <w:t xml:space="preserve">†</w:t>
+            </w:r>
           </w:p>
         </w:tc>
         <w:tc>
@@ -3523,6 +3544,9 @@
               </w:rPr>
               <w:t xml:space="preserve">4.372</w:t>
             </w:r>
+            <w:r>
+              <w:t xml:space="preserve">†</w:t>
+            </w:r>
           </w:p>
         </w:tc>
         <w:tc>
@@ -3539,17 +3563,20 @@
               </w:rPr>
               <w:t xml:space="preserve">2.366</w:t>
             </w:r>
-          </w:p>
-        </w:tc>
-        <w:tc>
-          <w:tcPr/>
-          <w:p>
-            <w:pPr>
-              <w:pStyle w:val="Compact"/>
-              <w:jc w:val="right"/>
-            </w:pPr>
-            <w:r>
-              <w:t xml:space="preserve">0.5800</w:t>
+            <w:r>
+              <w:t xml:space="preserve">†</w:t>
+            </w:r>
+          </w:p>
+        </w:tc>
+        <w:tc>
+          <w:tcPr/>
+          <w:p>
+            <w:pPr>
+              <w:pStyle w:val="Compact"/>
+              <w:jc w:val="right"/>
+            </w:pPr>
+            <w:r>
+              <w:t xml:space="preserve">0.5800†</w:t>
             </w:r>
           </w:p>
         </w:tc>
@@ -3567,6 +3594,9 @@
               </w:rPr>
               <w:t xml:space="preserve">0.2368</w:t>
             </w:r>
+            <w:r>
+              <w:t xml:space="preserve">†</w:t>
+            </w:r>
           </w:p>
         </w:tc>
       </w:tr>
@@ -3873,19 +3903,19 @@
               <w:jc w:val="right"/>
             </w:pPr>
             <w:r>
-              <w:t xml:space="preserve">2.147</w:t>
-            </w:r>
-          </w:p>
-        </w:tc>
-        <w:tc>
-          <w:tcPr/>
-          <w:p>
-            <w:pPr>
-              <w:pStyle w:val="Compact"/>
-              <w:jc w:val="right"/>
-            </w:pPr>
-            <w:r>
-              <w:t xml:space="preserve">4.633</w:t>
+              <w:t xml:space="preserve">2.147†</w:t>
+            </w:r>
+          </w:p>
+        </w:tc>
+        <w:tc>
+          <w:tcPr/>
+          <w:p>
+            <w:pPr>
+              <w:pStyle w:val="Compact"/>
+              <w:jc w:val="right"/>
+            </w:pPr>
+            <w:r>
+              <w:t xml:space="preserve">4.633†</w:t>
             </w:r>
           </w:p>
         </w:tc>
@@ -3909,19 +3939,19 @@
               <w:jc w:val="right"/>
             </w:pPr>
             <w:r>
-              <w:t xml:space="preserve">0.6059</w:t>
-            </w:r>
-          </w:p>
-        </w:tc>
-        <w:tc>
-          <w:tcPr/>
-          <w:p>
-            <w:pPr>
-              <w:pStyle w:val="Compact"/>
-              <w:jc w:val="right"/>
-            </w:pPr>
-            <w:r>
-              <w:t xml:space="preserve">0.1467</w:t>
+              <w:t xml:space="preserve">0.6059†</w:t>
+            </w:r>
+          </w:p>
+        </w:tc>
+        <w:tc>
+          <w:tcPr/>
+          <w:p>
+            <w:pPr>
+              <w:pStyle w:val="Compact"/>
+              <w:jc w:val="right"/>
+            </w:pPr>
+            <w:r>
+              <w:t xml:space="preserve">0.1467†</w:t>
             </w:r>
           </w:p>
         </w:tc>
@@ -4265,7 +4295,7 @@
               <w:jc w:val="right"/>
             </w:pPr>
             <w:r>
-              <w:t xml:space="preserve">0.6564</w:t>
+              <w:t xml:space="preserve">0.6564†</w:t>
             </w:r>
           </w:p>
         </w:tc>
@@ -4609,19 +4639,19 @@
               <w:jc w:val="right"/>
             </w:pPr>
             <w:r>
-              <w:t xml:space="preserve">2.884</w:t>
-            </w:r>
-          </w:p>
-        </w:tc>
-        <w:tc>
-          <w:tcPr/>
-          <w:p>
-            <w:pPr>
-              <w:pStyle w:val="Compact"/>
-              <w:jc w:val="right"/>
-            </w:pPr>
-            <w:r>
-              <w:t xml:space="preserve">0.6548</w:t>
+              <w:t xml:space="preserve">2.884†</w:t>
+            </w:r>
+          </w:p>
+        </w:tc>
+        <w:tc>
+          <w:tcPr/>
+          <w:p>
+            <w:pPr>
+              <w:pStyle w:val="Compact"/>
+              <w:jc w:val="right"/>
+            </w:pPr>
+            <w:r>
+              <w:t xml:space="preserve">0.6548†</w:t>
             </w:r>
           </w:p>
         </w:tc>

</xml_diff>

<commit_message>
paper: rename baseline model HAR->HAR-X (5-feature; literature HAR kept) + validation-aligned GARCH numbers + frozen-train note (Codex F1/F2/F4)
HAR-X = the 5-feature OLS baseline (3-lag HAR cascade + market factor + volume z-score); Corsi HAR / HARQ / GNN-HAR / 'HARd to beat' kept as literature. GARCH rows updated to the validation-aligned forecast (VN100 R2 now -4 to -5, frozen-train converges to unconditional variance). result.json GARCH regenerated to match. Main-table config unchanged (z-score+linear+floor).

Co-Authored-By: Claude Opus 4.8 (1M context) <noreply@anthropic.com>
</commit_message>
<xml_diff>
--- a/docs/paper/soict_paper_complete.docx
+++ b/docs/paper/soict_paper_complete.docx
@@ -94,7 +94,7 @@
         <w:t xml:space="preserve"> </w:t>
       </w:r>
       <w:r>
-        <w:t xml:space="preserve">daily Parkinson-variance forecasts relative to a linear Heterogeneous Autoregressive (HAR) baseline on the</w:t>
+        <w:t xml:space="preserve">daily Parkinson-variance forecasts relative to a linear Heterogeneous Autoregressive model, extended to five features (HAR-X), on the</w:t>
       </w:r>
       <w:r>
         <w:t xml:space="preserve"> </w:t>
@@ -106,7 +106,7 @@
         <w:t xml:space="preserve"> </w:t>
       </w:r>
       <w:r>
-        <w:t xml:space="preserve">models share the same five node features: a linear HAR, a</w:t>
+        <w:t xml:space="preserve">models share the same five node features: a linear HAR-X, a</w:t>
       </w:r>
       <w:r>
         <w:t xml:space="preserve"> </w:t>
@@ -130,19 +130,19 @@
         <w:t xml:space="preserve"> </w:t>
       </w:r>
       <w:r>
-        <w:t xml:space="preserve">The primary target is short-term (horizons h ∈ {1, 5}); h ∈ {10, 22} are an extended study. HAR has the</w:t>
-      </w:r>
-      <w:r>
-        <w:t xml:space="preserve"> </w:t>
-      </w:r>
-      <w:r>
-        <w:t xml:space="preserve">lowest QLIKE on both panels at every horizon, and no learned model has a significantly lower QLIKE than HAR</w:t>
-      </w:r>
-      <w:r>
-        <w:t xml:space="preserve"> </w:t>
-      </w:r>
-      <w:r>
-        <w:t xml:space="preserve">(date-clustered DM, p ≥ 0.05). At h1 and h5 the deep models have the lowest MAE on VN100 (LSTM versus HAR,</w:t>
+        <w:t xml:space="preserve">The primary target is short-term (horizons h ∈ {1, 5}); h ∈ {10, 22} are an extended study. HAR-X has the</w:t>
+      </w:r>
+      <w:r>
+        <w:t xml:space="preserve"> </w:t>
+      </w:r>
+      <w:r>
+        <w:t xml:space="preserve">lowest QLIKE on both panels at every horizon, and no learned model has a significantly lower QLIKE than HAR-X</w:t>
+      </w:r>
+      <w:r>
+        <w:t xml:space="preserve"> </w:t>
+      </w:r>
+      <w:r>
+        <w:t xml:space="preserve">(date-clustered DM, p ≥ 0.05). At h1 and h5 the deep models have the lowest MAE on VN100 (LSTM versus HAR-X,</w:t>
       </w:r>
       <w:r>
         <w:t xml:space="preserve"> </w:t>
@@ -154,13 +154,13 @@
         <w:t xml:space="preserve"> </w:t>
       </w:r>
       <w:r>
-        <w:t xml:space="preserve">p&lt;0.001, h5 p=0.022; VN30 h1 p&lt;0.001, h5 p=0.031), reaching HAR’s QLIKE level at VN100 h5 (0.5690 versus</w:t>
-      </w:r>
-      <w:r>
-        <w:t xml:space="preserve"> </w:t>
-      </w:r>
-      <w:r>
-        <w:t xml:space="preserve">0.5633). At h10 and h22 HAR has the lowest MSE, RMSE, QLIKE and R², and the LSTM+GAT-versus-LSTM QLIKE</w:t>
+        <w:t xml:space="preserve">p&lt;0.001, h5 p=0.022; VN30 h1 p&lt;0.001, h5 p=0.031), reaching HAR-X’s QLIKE level at VN100 h5 (0.5690 versus</w:t>
+      </w:r>
+      <w:r>
+        <w:t xml:space="preserve"> </w:t>
+      </w:r>
+      <w:r>
+        <w:t xml:space="preserve">0.5633). At h10 and h22 HAR-X has the lowest MSE, RMSE, QLIKE and R², and the LSTM+GAT-versus-LSTM QLIKE</w:t>
       </w:r>
       <w:r>
         <w:t xml:space="preserve"> </w:t>
@@ -259,7 +259,7 @@
         <w:t xml:space="preserve"> </w:t>
       </w:r>
       <w:r>
-        <w:t xml:space="preserve">temporal nonlinearity or the cross-sectional graph changes the forecast relative to a linear HAR. We ask two</w:t>
+        <w:t xml:space="preserve">temporal nonlinearity or the cross-sectional graph changes the forecast relative to a linear HAR-X. We ask two</w:t>
       </w:r>
       <w:r>
         <w:t xml:space="preserve"> </w:t>
@@ -283,7 +283,7 @@
         <w:t xml:space="preserve"> </w:t>
       </w:r>
       <w:r>
-        <w:t xml:space="preserve">linear HAR, and at which horizons and metrics?</w:t>
+        <w:t xml:space="preserve">linear HAR-X, and at which horizons and metrics?</w:t>
       </w:r>
     </w:p>
     <w:p>
@@ -354,7 +354,7 @@
         <w:t xml:space="preserve"> </w:t>
       </w:r>
       <w:r>
-        <w:t xml:space="preserve">the feature set and the data design fixed across HAR, an LSTM and an LSTM+GAT, so any difference is</w:t>
+        <w:t xml:space="preserve">the feature set and the data design fixed across HAR-X, an LSTM and an LSTM+GAT, so any difference is</w:t>
       </w:r>
       <w:r>
         <w:t xml:space="preserve"> </w:t>
@@ -366,7 +366,7 @@
         <w:t xml:space="preserve"> </w:t>
       </w:r>
       <w:r>
-        <w:t xml:space="preserve">test — HAR has the lowest QLIKE at every horizon with no learned model significantly lower, the deep models</w:t>
+        <w:t xml:space="preserve">test — HAR-X has the lowest QLIKE at every horizon with no learned model significantly lower, the deep models</w:t>
       </w:r>
       <w:r>
         <w:t xml:space="preserve"> </w:t>
@@ -455,7 +455,7 @@
         <w:t xml:space="preserve"> </w:t>
       </w:r>
       <w:r>
-        <w:t xml:space="preserve">remain standard conditional-variance benchmarks. We use HAR as the linear baseline and GARCH(1,1) as a classical benchmark.</w:t>
+        <w:t xml:space="preserve">remain standard conditional-variance benchmarks. We use HAR-X as the linear baseline and GARCH(1,1) as a classical benchmark.</w:t>
       </w:r>
     </w:p>
     <w:p>
@@ -663,7 +663,7 @@
         <w:t xml:space="preserve"> </w:t>
       </w:r>
       <w:r>
-        <w:t xml:space="preserve">study. All three feature-based models (HAR, LSTM, LSTM+GAT) use the same five node features per ticker at day</w:t>
+        <w:t xml:space="preserve">study. All three feature-based models (HAR-X, LSTM, LSTM+GAT) use the same five node features per ticker at day</w:t>
       </w:r>
       <w:r>
         <w:t xml:space="preserve"> </w:t>
@@ -713,13 +713,13 @@
           <w:b/>
           <w:bCs/>
         </w:rPr>
-        <w:t xml:space="preserve">HAR</w:t>
-      </w:r>
-      <w:r>
-        <w:t xml:space="preserve"> </w:t>
-      </w:r>
-      <w:r>
-        <w:t xml:space="preserve">(baseline): pooled ordinary-least-squares regression on the five features, linear.</w:t>
+        <w:t xml:space="preserve">HAR-X</w:t>
+      </w:r>
+      <w:r>
+        <w:t xml:space="preserve"> </w:t>
+      </w:r>
+      <w:r>
+        <w:t xml:space="preserve">(baseline): pooled ordinary-least-squares regression on the five features (the HAR cascade augmented with a market Parkinson factor and a volume z-score), linear.</w:t>
       </w:r>
     </w:p>
     <w:p>
@@ -1054,7 +1054,7 @@
         <w:t xml:space="preserve"> </w:t>
       </w:r>
       <w:r>
-        <w:t xml:space="preserve">HAR, LSTM and LSTM+GAT — is trained and evaluated on the same panel with the same five features and the same</w:t>
+        <w:t xml:space="preserve">HAR-X, LSTM and LSTM+GAT — is trained and evaluated on the same panel with the same five features and the same</w:t>
       </w:r>
       <w:r>
         <w:t xml:space="preserve"> </w:t>
@@ -1171,7 +1171,7 @@
         <w:t xml:space="preserve"> </w:t>
       </w:r>
       <w:r>
-        <w:t xml:space="preserve">the date-clustered test. We report two targeted contrasts — LSTM versus HAR and LSTM+GAT versus LSTM — on</w:t>
+        <w:t xml:space="preserve">the date-clustered test. We report two targeted contrasts — LSTM versus HAR-X and LSTM+GAT versus LSTM — on</w:t>
       </w:r>
       <w:r>
         <w:t xml:space="preserve"> </w:t>
@@ -1396,7 +1396,7 @@
         <w:pStyle w:val="FirstParagraph"/>
       </w:pPr>
       <w:r>
-        <w:t xml:space="preserve">We compare HAR, the five-feature LSTM and the five-feature LSTM+GAT (directed volume→Parkinson weighted</w:t>
+        <w:t xml:space="preserve">We compare HAR-X, the five-feature LSTM and the five-feature LSTM+GAT (directed volume→Parkinson weighted</w:t>
       </w:r>
       <w:r>
         <w:t xml:space="preserve"> </w:t>
@@ -1408,7 +1408,7 @@
         <w:t xml:space="preserve"> </w:t>
       </w:r>
       <w:r>
-        <w:t xml:space="preserve">five metrics and the two targeted date-clustered DM contrasts (LSTM versus HAR, LSTM+GAT versus LSTM).</w:t>
+        <w:t xml:space="preserve">five metrics and the two targeted date-clustered DM contrasts (LSTM versus HAR-X, LSTM+GAT versus LSTM).</w:t>
       </w:r>
     </w:p>
     <w:p>
@@ -1484,7 +1484,7 @@
         <w:t xml:space="preserve">results/masked_rich_floor1e2/</w:t>
       </w:r>
       <w:r>
-        <w:t xml:space="preserve">). Row order is HAR → GARCH → LSTM → LSTM+GAT.</w:t>
+        <w:t xml:space="preserve">). Row order is HAR-X → GARCH → LSTM → LSTM+GAT.</w:t>
       </w:r>
     </w:p>
     <w:p>
@@ -1687,7 +1687,7 @@
               <w:pStyle w:val="Compact"/>
             </w:pPr>
             <w:r>
-              <w:t xml:space="preserve">HAR</w:t>
+              <w:t xml:space="preserve">HAR-X</w:t>
             </w:r>
           </w:p>
         </w:tc>
@@ -1783,55 +1783,55 @@
               <w:jc w:val="right"/>
             </w:pPr>
             <w:r>
-              <w:t xml:space="preserve">5.917</w:t>
-            </w:r>
-          </w:p>
-        </w:tc>
-        <w:tc>
-          <w:tcPr/>
-          <w:p>
-            <w:pPr>
-              <w:pStyle w:val="Compact"/>
-              <w:jc w:val="right"/>
-            </w:pPr>
-            <w:r>
-              <w:t xml:space="preserve">7.692</w:t>
-            </w:r>
-          </w:p>
-        </w:tc>
-        <w:tc>
-          <w:tcPr/>
-          <w:p>
-            <w:pPr>
-              <w:pStyle w:val="Compact"/>
-              <w:jc w:val="right"/>
-            </w:pPr>
-            <w:r>
-              <w:t xml:space="preserve">5.195</w:t>
-            </w:r>
-          </w:p>
-        </w:tc>
-        <w:tc>
-          <w:tcPr/>
-          <w:p>
-            <w:pPr>
-              <w:pStyle w:val="Compact"/>
-              <w:jc w:val="right"/>
-            </w:pPr>
-            <w:r>
-              <w:t xml:space="preserve">0.7964</w:t>
-            </w:r>
-          </w:p>
-        </w:tc>
-        <w:tc>
-          <w:tcPr/>
-          <w:p>
-            <w:pPr>
-              <w:pStyle w:val="Compact"/>
-              <w:jc w:val="right"/>
-            </w:pPr>
-            <w:r>
-              <w:t xml:space="preserve">-0.9407</w:t>
+              <w:t xml:space="preserve">15.571</w:t>
+            </w:r>
+          </w:p>
+        </w:tc>
+        <w:tc>
+          <w:tcPr/>
+          <w:p>
+            <w:pPr>
+              <w:pStyle w:val="Compact"/>
+              <w:jc w:val="right"/>
+            </w:pPr>
+            <w:r>
+              <w:t xml:space="preserve">12.478</w:t>
+            </w:r>
+          </w:p>
+        </w:tc>
+        <w:tc>
+          <w:tcPr/>
+          <w:p>
+            <w:pPr>
+              <w:pStyle w:val="Compact"/>
+              <w:jc w:val="right"/>
+            </w:pPr>
+            <w:r>
+              <w:t xml:space="preserve">5.915</w:t>
+            </w:r>
+          </w:p>
+        </w:tc>
+        <w:tc>
+          <w:tcPr/>
+          <w:p>
+            <w:pPr>
+              <w:pStyle w:val="Compact"/>
+              <w:jc w:val="right"/>
+            </w:pPr>
+            <w:r>
+              <w:t xml:space="preserve">0.8059</w:t>
+            </w:r>
+          </w:p>
+        </w:tc>
+        <w:tc>
+          <w:tcPr/>
+          <w:p>
+            <w:pPr>
+              <w:pStyle w:val="Compact"/>
+              <w:jc w:val="right"/>
+            </w:pPr>
+            <w:r>
+              <w:t xml:space="preserve">-4.1076</w:t>
             </w:r>
           </w:p>
         </w:tc>
@@ -2058,7 +2058,7 @@
               <w:pStyle w:val="Compact"/>
             </w:pPr>
             <w:r>
-              <w:t xml:space="preserve">HAR</w:t>
+              <w:t xml:space="preserve">HAR-X</w:t>
             </w:r>
           </w:p>
         </w:tc>
@@ -2170,55 +2170,55 @@
               <w:jc w:val="right"/>
             </w:pPr>
             <w:r>
-              <w:t xml:space="preserve">5.843</w:t>
-            </w:r>
-          </w:p>
-        </w:tc>
-        <w:tc>
-          <w:tcPr/>
-          <w:p>
-            <w:pPr>
-              <w:pStyle w:val="Compact"/>
-              <w:jc w:val="right"/>
-            </w:pPr>
-            <w:r>
-              <w:t xml:space="preserve">7.644</w:t>
-            </w:r>
-          </w:p>
-        </w:tc>
-        <w:tc>
-          <w:tcPr/>
-          <w:p>
-            <w:pPr>
-              <w:pStyle w:val="Compact"/>
-              <w:jc w:val="right"/>
-            </w:pPr>
-            <w:r>
-              <w:t xml:space="preserve">5.197</w:t>
-            </w:r>
-          </w:p>
-        </w:tc>
-        <w:tc>
-          <w:tcPr/>
-          <w:p>
-            <w:pPr>
-              <w:pStyle w:val="Compact"/>
-              <w:jc w:val="right"/>
-            </w:pPr>
-            <w:r>
-              <w:t xml:space="preserve">0.7865</w:t>
-            </w:r>
-          </w:p>
-        </w:tc>
-        <w:tc>
-          <w:tcPr/>
-          <w:p>
-            <w:pPr>
-              <w:pStyle w:val="Compact"/>
-              <w:jc w:val="right"/>
-            </w:pPr>
-            <w:r>
-              <w:t xml:space="preserve">-0.9136</w:t>
+              <w:t xml:space="preserve">14.844</w:t>
+            </w:r>
+          </w:p>
+        </w:tc>
+        <w:tc>
+          <w:tcPr/>
+          <w:p>
+            <w:pPr>
+              <w:pStyle w:val="Compact"/>
+              <w:jc w:val="right"/>
+            </w:pPr>
+            <w:r>
+              <w:t xml:space="preserve">12.184</w:t>
+            </w:r>
+          </w:p>
+        </w:tc>
+        <w:tc>
+          <w:tcPr/>
+          <w:p>
+            <w:pPr>
+              <w:pStyle w:val="Compact"/>
+              <w:jc w:val="right"/>
+            </w:pPr>
+            <w:r>
+              <w:t xml:space="preserve">5.909</w:t>
+            </w:r>
+          </w:p>
+        </w:tc>
+        <w:tc>
+          <w:tcPr/>
+          <w:p>
+            <w:pPr>
+              <w:pStyle w:val="Compact"/>
+              <w:jc w:val="right"/>
+            </w:pPr>
+            <w:r>
+              <w:t xml:space="preserve">0.7898</w:t>
+            </w:r>
+          </w:p>
+        </w:tc>
+        <w:tc>
+          <w:tcPr/>
+          <w:p>
+            <w:pPr>
+              <w:pStyle w:val="Compact"/>
+              <w:jc w:val="right"/>
+            </w:pPr>
+            <w:r>
+              <w:t xml:space="preserve">-3.8618</w:t>
             </w:r>
           </w:p>
         </w:tc>
@@ -2414,7 +2414,7 @@
               <w:pStyle w:val="Compact"/>
             </w:pPr>
             <w:r>
-              <w:t xml:space="preserve">HAR</w:t>
+              <w:t xml:space="preserve">HAR-X</w:t>
             </w:r>
           </w:p>
         </w:tc>
@@ -2526,55 +2526,55 @@
               <w:jc w:val="right"/>
             </w:pPr>
             <w:r>
-              <w:t xml:space="preserve">6.399</w:t>
-            </w:r>
-          </w:p>
-        </w:tc>
-        <w:tc>
-          <w:tcPr/>
-          <w:p>
-            <w:pPr>
-              <w:pStyle w:val="Compact"/>
-              <w:jc w:val="right"/>
-            </w:pPr>
-            <w:r>
-              <w:t xml:space="preserve">7.999</w:t>
-            </w:r>
-          </w:p>
-        </w:tc>
-        <w:tc>
-          <w:tcPr/>
-          <w:p>
-            <w:pPr>
-              <w:pStyle w:val="Compact"/>
-              <w:jc w:val="right"/>
-            </w:pPr>
-            <w:r>
-              <w:t xml:space="preserve">5.306</w:t>
-            </w:r>
-          </w:p>
-        </w:tc>
-        <w:tc>
-          <w:tcPr/>
-          <w:p>
-            <w:pPr>
-              <w:pStyle w:val="Compact"/>
-              <w:jc w:val="right"/>
-            </w:pPr>
-            <w:r>
-              <w:t xml:space="preserve">0.8018</w:t>
-            </w:r>
-          </w:p>
-        </w:tc>
-        <w:tc>
-          <w:tcPr/>
-          <w:p>
-            <w:pPr>
-              <w:pStyle w:val="Compact"/>
-              <w:jc w:val="right"/>
-            </w:pPr>
-            <w:r>
-              <w:t xml:space="preserve">-1.0957</w:t>
+              <w:t xml:space="preserve">16.843</w:t>
+            </w:r>
+          </w:p>
+        </w:tc>
+        <w:tc>
+          <w:tcPr/>
+          <w:p>
+            <w:pPr>
+              <w:pStyle w:val="Compact"/>
+              <w:jc w:val="right"/>
+            </w:pPr>
+            <w:r>
+              <w:t xml:space="preserve">12.978</w:t>
+            </w:r>
+          </w:p>
+        </w:tc>
+        <w:tc>
+          <w:tcPr/>
+          <w:p>
+            <w:pPr>
+              <w:pStyle w:val="Compact"/>
+              <w:jc w:val="right"/>
+            </w:pPr>
+            <w:r>
+              <w:t xml:space="preserve">6.018</w:t>
+            </w:r>
+          </w:p>
+        </w:tc>
+        <w:tc>
+          <w:tcPr/>
+          <w:p>
+            <w:pPr>
+              <w:pStyle w:val="Compact"/>
+              <w:jc w:val="right"/>
+            </w:pPr>
+            <w:r>
+              <w:t xml:space="preserve">0.8077</w:t>
+            </w:r>
+          </w:p>
+        </w:tc>
+        <w:tc>
+          <w:tcPr/>
+          <w:p>
+            <w:pPr>
+              <w:pStyle w:val="Compact"/>
+              <w:jc w:val="right"/>
+            </w:pPr>
+            <w:r>
+              <w:t xml:space="preserve">-4.5165</w:t>
             </w:r>
           </w:p>
         </w:tc>
@@ -2773,7 +2773,7 @@
               <w:pStyle w:val="Compact"/>
             </w:pPr>
             <w:r>
-              <w:t xml:space="preserve">HAR</w:t>
+              <w:t xml:space="preserve">HAR-X</w:t>
             </w:r>
           </w:p>
         </w:tc>
@@ -2885,55 +2885,55 @@
               <w:jc w:val="right"/>
             </w:pPr>
             <w:r>
-              <w:t xml:space="preserve">7.089</w:t>
-            </w:r>
-          </w:p>
-        </w:tc>
-        <w:tc>
-          <w:tcPr/>
-          <w:p>
-            <w:pPr>
-              <w:pStyle w:val="Compact"/>
-              <w:jc w:val="right"/>
-            </w:pPr>
-            <w:r>
-              <w:t xml:space="preserve">8.420</w:t>
-            </w:r>
-          </w:p>
-        </w:tc>
-        <w:tc>
-          <w:tcPr/>
-          <w:p>
-            <w:pPr>
-              <w:pStyle w:val="Compact"/>
-              <w:jc w:val="right"/>
-            </w:pPr>
-            <w:r>
-              <w:t xml:space="preserve">5.360</w:t>
-            </w:r>
-          </w:p>
-        </w:tc>
-        <w:tc>
-          <w:tcPr/>
-          <w:p>
-            <w:pPr>
-              <w:pStyle w:val="Compact"/>
-              <w:jc w:val="right"/>
-            </w:pPr>
-            <w:r>
-              <w:t xml:space="preserve">0.7928</w:t>
-            </w:r>
-          </w:p>
-        </w:tc>
-        <w:tc>
-          <w:tcPr/>
-          <w:p>
-            <w:pPr>
-              <w:pStyle w:val="Compact"/>
-              <w:jc w:val="right"/>
-            </w:pPr>
-            <w:r>
-              <w:t xml:space="preserve">-1.3184</w:t>
+              <w:t xml:space="preserve">19.345</w:t>
+            </w:r>
+          </w:p>
+        </w:tc>
+        <w:tc>
+          <w:tcPr/>
+          <w:p>
+            <w:pPr>
+              <w:pStyle w:val="Compact"/>
+              <w:jc w:val="right"/>
+            </w:pPr>
+            <w:r>
+              <w:t xml:space="preserve">13.909</w:t>
+            </w:r>
+          </w:p>
+        </w:tc>
+        <w:tc>
+          <w:tcPr/>
+          <w:p>
+            <w:pPr>
+              <w:pStyle w:val="Compact"/>
+              <w:jc w:val="right"/>
+            </w:pPr>
+            <w:r>
+              <w:t xml:space="preserve">6.151</w:t>
+            </w:r>
+          </w:p>
+        </w:tc>
+        <w:tc>
+          <w:tcPr/>
+          <w:p>
+            <w:pPr>
+              <w:pStyle w:val="Compact"/>
+              <w:jc w:val="right"/>
+            </w:pPr>
+            <w:r>
+              <w:t xml:space="preserve">0.7923</w:t>
+            </w:r>
+          </w:p>
+        </w:tc>
+        <w:tc>
+          <w:tcPr/>
+          <w:p>
+            <w:pPr>
+              <w:pStyle w:val="Compact"/>
+              <w:jc w:val="right"/>
+            </w:pPr>
+            <w:r>
+              <w:t xml:space="preserve">-5.3264</w:t>
             </w:r>
           </w:p>
         </w:tc>
@@ -3251,7 +3251,7 @@
               <w:pStyle w:val="Compact"/>
             </w:pPr>
             <w:r>
-              <w:t xml:space="preserve">HAR</w:t>
+              <w:t xml:space="preserve">HAR-X</w:t>
             </w:r>
           </w:p>
         </w:tc>
@@ -3351,55 +3351,55 @@
               <w:jc w:val="right"/>
             </w:pPr>
             <w:r>
-              <w:t xml:space="preserve">2.770</w:t>
-            </w:r>
-          </w:p>
-        </w:tc>
-        <w:tc>
-          <w:tcPr/>
-          <w:p>
-            <w:pPr>
-              <w:pStyle w:val="Compact"/>
-              <w:jc w:val="right"/>
-            </w:pPr>
-            <w:r>
-              <w:t xml:space="preserve">5.263</w:t>
-            </w:r>
-          </w:p>
-        </w:tc>
-        <w:tc>
-          <w:tcPr/>
-          <w:p>
-            <w:pPr>
-              <w:pStyle w:val="Compact"/>
-              <w:jc w:val="right"/>
-            </w:pPr>
-            <w:r>
-              <w:t xml:space="preserve">3.453</w:t>
-            </w:r>
-          </w:p>
-        </w:tc>
-        <w:tc>
-          <w:tcPr/>
-          <w:p>
-            <w:pPr>
-              <w:pStyle w:val="Compact"/>
-              <w:jc w:val="right"/>
-            </w:pPr>
-            <w:r>
-              <w:t xml:space="preserve">0.7911</w:t>
-            </w:r>
-          </w:p>
-        </w:tc>
-        <w:tc>
-          <w:tcPr/>
-          <w:p>
-            <w:pPr>
-              <w:pStyle w:val="Compact"/>
-              <w:jc w:val="right"/>
-            </w:pPr>
-            <w:r>
-              <w:t xml:space="preserve">-0.1060</w:t>
+              <w:t xml:space="preserve">2.788</w:t>
+            </w:r>
+          </w:p>
+        </w:tc>
+        <w:tc>
+          <w:tcPr/>
+          <w:p>
+            <w:pPr>
+              <w:pStyle w:val="Compact"/>
+              <w:jc w:val="right"/>
+            </w:pPr>
+            <w:r>
+              <w:t xml:space="preserve">5.280</w:t>
+            </w:r>
+          </w:p>
+        </w:tc>
+        <w:tc>
+          <w:tcPr/>
+          <w:p>
+            <w:pPr>
+              <w:pStyle w:val="Compact"/>
+              <w:jc w:val="right"/>
+            </w:pPr>
+            <w:r>
+              <w:t xml:space="preserve">3.480</w:t>
+            </w:r>
+          </w:p>
+        </w:tc>
+        <w:tc>
+          <w:tcPr/>
+          <w:p>
+            <w:pPr>
+              <w:pStyle w:val="Compact"/>
+              <w:jc w:val="right"/>
+            </w:pPr>
+            <w:r>
+              <w:t xml:space="preserve">0.7954</w:t>
+            </w:r>
+          </w:p>
+        </w:tc>
+        <w:tc>
+          <w:tcPr/>
+          <w:p>
+            <w:pPr>
+              <w:pStyle w:val="Compact"/>
+              <w:jc w:val="right"/>
+            </w:pPr>
+            <w:r>
+              <w:t xml:space="preserve">-0.1129</w:t>
             </w:r>
           </w:p>
         </w:tc>
@@ -3619,7 +3619,7 @@
               <w:pStyle w:val="Compact"/>
             </w:pPr>
             <w:r>
-              <w:t xml:space="preserve">HAR</w:t>
+              <w:t xml:space="preserve">HAR-X</w:t>
             </w:r>
           </w:p>
         </w:tc>
@@ -3735,55 +3735,55 @@
               <w:jc w:val="right"/>
             </w:pPr>
             <w:r>
-              <w:t xml:space="preserve">2.785</w:t>
-            </w:r>
-          </w:p>
-        </w:tc>
-        <w:tc>
-          <w:tcPr/>
-          <w:p>
-            <w:pPr>
-              <w:pStyle w:val="Compact"/>
-              <w:jc w:val="right"/>
-            </w:pPr>
-            <w:r>
-              <w:t xml:space="preserve">5.277</w:t>
-            </w:r>
-          </w:p>
-        </w:tc>
-        <w:tc>
-          <w:tcPr/>
-          <w:p>
-            <w:pPr>
-              <w:pStyle w:val="Compact"/>
-              <w:jc w:val="right"/>
-            </w:pPr>
-            <w:r>
-              <w:t xml:space="preserve">3.492</w:t>
-            </w:r>
-          </w:p>
-        </w:tc>
-        <w:tc>
-          <w:tcPr/>
-          <w:p>
-            <w:pPr>
-              <w:pStyle w:val="Compact"/>
-              <w:jc w:val="right"/>
-            </w:pPr>
-            <w:r>
-              <w:t xml:space="preserve">0.7864</w:t>
-            </w:r>
-          </w:p>
-        </w:tc>
-        <w:tc>
-          <w:tcPr/>
-          <w:p>
-            <w:pPr>
-              <w:pStyle w:val="Compact"/>
-              <w:jc w:val="right"/>
-            </w:pPr>
-            <w:r>
-              <w:t xml:space="preserve">-0.1071</w:t>
+              <w:t xml:space="preserve">2.783</w:t>
+            </w:r>
+          </w:p>
+        </w:tc>
+        <w:tc>
+          <w:tcPr/>
+          <w:p>
+            <w:pPr>
+              <w:pStyle w:val="Compact"/>
+              <w:jc w:val="right"/>
+            </w:pPr>
+            <w:r>
+              <w:t xml:space="preserve">5.276</w:t>
+            </w:r>
+          </w:p>
+        </w:tc>
+        <w:tc>
+          <w:tcPr/>
+          <w:p>
+            <w:pPr>
+              <w:pStyle w:val="Compact"/>
+              <w:jc w:val="right"/>
+            </w:pPr>
+            <w:r>
+              <w:t xml:space="preserve">3.489</w:t>
+            </w:r>
+          </w:p>
+        </w:tc>
+        <w:tc>
+          <w:tcPr/>
+          <w:p>
+            <w:pPr>
+              <w:pStyle w:val="Compact"/>
+              <w:jc w:val="right"/>
+            </w:pPr>
+            <w:r>
+              <w:t xml:space="preserve">0.7859</w:t>
+            </w:r>
+          </w:p>
+        </w:tc>
+        <w:tc>
+          <w:tcPr/>
+          <w:p>
+            <w:pPr>
+              <w:pStyle w:val="Compact"/>
+              <w:jc w:val="right"/>
+            </w:pPr>
+            <w:r>
+              <w:t xml:space="preserve">-0.1065</w:t>
             </w:r>
           </w:p>
         </w:tc>
@@ -3975,7 +3975,7 @@
               <w:pStyle w:val="Compact"/>
             </w:pPr>
             <w:r>
-              <w:t xml:space="preserve">HAR</w:t>
+              <w:t xml:space="preserve">HAR-X</w:t>
             </w:r>
           </w:p>
         </w:tc>
@@ -4087,55 +4087,55 @@
               <w:jc w:val="right"/>
             </w:pPr>
             <w:r>
-              <w:t xml:space="preserve">2.835</w:t>
-            </w:r>
-          </w:p>
-        </w:tc>
-        <w:tc>
-          <w:tcPr/>
-          <w:p>
-            <w:pPr>
-              <w:pStyle w:val="Compact"/>
-              <w:jc w:val="right"/>
-            </w:pPr>
-            <w:r>
-              <w:t xml:space="preserve">5.324</w:t>
-            </w:r>
-          </w:p>
-        </w:tc>
-        <w:tc>
-          <w:tcPr/>
-          <w:p>
-            <w:pPr>
-              <w:pStyle w:val="Compact"/>
-              <w:jc w:val="right"/>
-            </w:pPr>
-            <w:r>
-              <w:t xml:space="preserve">3.503</w:t>
-            </w:r>
-          </w:p>
-        </w:tc>
-        <w:tc>
-          <w:tcPr/>
-          <w:p>
-            <w:pPr>
-              <w:pStyle w:val="Compact"/>
-              <w:jc w:val="right"/>
-            </w:pPr>
-            <w:r>
-              <w:t xml:space="preserve">0.7791</w:t>
-            </w:r>
-          </w:p>
-        </w:tc>
-        <w:tc>
-          <w:tcPr/>
-          <w:p>
-            <w:pPr>
-              <w:pStyle w:val="Compact"/>
-              <w:jc w:val="right"/>
-            </w:pPr>
-            <w:r>
-              <w:t xml:space="preserve">-0.1052</w:t>
+              <w:t xml:space="preserve">2.829</w:t>
+            </w:r>
+          </w:p>
+        </w:tc>
+        <w:tc>
+          <w:tcPr/>
+          <w:p>
+            <w:pPr>
+              <w:pStyle w:val="Compact"/>
+              <w:jc w:val="right"/>
+            </w:pPr>
+            <w:r>
+              <w:t xml:space="preserve">5.319</w:t>
+            </w:r>
+          </w:p>
+        </w:tc>
+        <w:tc>
+          <w:tcPr/>
+          <w:p>
+            <w:pPr>
+              <w:pStyle w:val="Compact"/>
+              <w:jc w:val="right"/>
+            </w:pPr>
+            <w:r>
+              <w:t xml:space="preserve">3.508</w:t>
+            </w:r>
+          </w:p>
+        </w:tc>
+        <w:tc>
+          <w:tcPr/>
+          <w:p>
+            <w:pPr>
+              <w:pStyle w:val="Compact"/>
+              <w:jc w:val="right"/>
+            </w:pPr>
+            <w:r>
+              <w:t xml:space="preserve">0.7774</w:t>
+            </w:r>
+          </w:p>
+        </w:tc>
+        <w:tc>
+          <w:tcPr/>
+          <w:p>
+            <w:pPr>
+              <w:pStyle w:val="Compact"/>
+              <w:jc w:val="right"/>
+            </w:pPr>
+            <w:r>
+              <w:t xml:space="preserve">-0.1029</w:t>
             </w:r>
           </w:p>
         </w:tc>
@@ -4331,7 +4331,7 @@
               <w:pStyle w:val="Compact"/>
             </w:pPr>
             <w:r>
-              <w:t xml:space="preserve">HAR</w:t>
+              <w:t xml:space="preserve">HAR-X</w:t>
             </w:r>
           </w:p>
         </w:tc>
@@ -4447,55 +4447,55 @@
               <w:jc w:val="right"/>
             </w:pPr>
             <w:r>
-              <w:t xml:space="preserve">2.709</w:t>
-            </w:r>
-          </w:p>
-        </w:tc>
-        <w:tc>
-          <w:tcPr/>
-          <w:p>
-            <w:pPr>
-              <w:pStyle w:val="Compact"/>
-              <w:jc w:val="right"/>
-            </w:pPr>
-            <w:r>
-              <w:t xml:space="preserve">5.205</w:t>
-            </w:r>
-          </w:p>
-        </w:tc>
-        <w:tc>
-          <w:tcPr/>
-          <w:p>
-            <w:pPr>
-              <w:pStyle w:val="Compact"/>
-              <w:jc w:val="right"/>
-            </w:pPr>
-            <w:r>
-              <w:t xml:space="preserve">3.413</w:t>
-            </w:r>
-          </w:p>
-        </w:tc>
-        <w:tc>
-          <w:tcPr/>
-          <w:p>
-            <w:pPr>
-              <w:pStyle w:val="Compact"/>
-              <w:jc w:val="right"/>
-            </w:pPr>
-            <w:r>
-              <w:t xml:space="preserve">0.7445</w:t>
-            </w:r>
-          </w:p>
-        </w:tc>
-        <w:tc>
-          <w:tcPr/>
-          <w:p>
-            <w:pPr>
-              <w:pStyle w:val="Compact"/>
-              <w:jc w:val="right"/>
-            </w:pPr>
-            <w:r>
-              <w:t xml:space="preserve">-0.1064</w:t>
+              <w:t xml:space="preserve">2.719</w:t>
+            </w:r>
+          </w:p>
+        </w:tc>
+        <w:tc>
+          <w:tcPr/>
+          <w:p>
+            <w:pPr>
+              <w:pStyle w:val="Compact"/>
+              <w:jc w:val="right"/>
+            </w:pPr>
+            <w:r>
+              <w:t xml:space="preserve">5.214</w:t>
+            </w:r>
+          </w:p>
+        </w:tc>
+        <w:tc>
+          <w:tcPr/>
+          <w:p>
+            <w:pPr>
+              <w:pStyle w:val="Compact"/>
+              <w:jc w:val="right"/>
+            </w:pPr>
+            <w:r>
+              <w:t xml:space="preserve">3.437</w:t>
+            </w:r>
+          </w:p>
+        </w:tc>
+        <w:tc>
+          <w:tcPr/>
+          <w:p>
+            <w:pPr>
+              <w:pStyle w:val="Compact"/>
+              <w:jc w:val="right"/>
+            </w:pPr>
+            <w:r>
+              <w:t xml:space="preserve">0.7452</w:t>
+            </w:r>
+          </w:p>
+        </w:tc>
+        <w:tc>
+          <w:tcPr/>
+          <w:p>
+            <w:pPr>
+              <w:pStyle w:val="Compact"/>
+              <w:jc w:val="right"/>
+            </w:pPr>
+            <w:r>
+              <w:t xml:space="preserve">-0.1102</w:t>
             </w:r>
           </w:p>
         </w:tc>
@@ -4684,7 +4684,7 @@
         <w:t xml:space="preserve"> </w:t>
       </w:r>
       <w:r>
-        <w:t xml:space="preserve">H = HAR, L = LSTM, G = LSTM+GAT, on QLIKE and MAE.</w:t>
+        <w:t xml:space="preserve">H = HAR-X, L = LSTM, G = LSTM+GAT, on QLIKE and MAE.</w:t>
       </w:r>
     </w:p>
     <w:tbl>
@@ -4735,7 +4735,7 @@
               <w:pStyle w:val="Compact"/>
             </w:pPr>
             <w:r>
-              <w:t xml:space="preserve">LSTM vs HAR (QLIKE)</w:t>
+              <w:t xml:space="preserve">LSTM vs HAR-X (QLIKE)</w:t>
             </w:r>
           </w:p>
         </w:tc>
@@ -5419,13 +5419,13 @@
         <w:t xml:space="preserve"> </w:t>
       </w:r>
       <w:r>
-        <w:t xml:space="preserve">0.5107, R² 0.2251). By date-clustered DM, the LSTM has a lower MAE than HAR (p&lt;0.001), the LSTM has a higher</w:t>
-      </w:r>
-      <w:r>
-        <w:t xml:space="preserve"> </w:t>
-      </w:r>
-      <w:r>
-        <w:t xml:space="preserve">QLIKE than HAR (p=0.028), and the LSTM+GAT has a lower QLIKE than the no-graph LSTM (p&lt;0.001).</w:t>
+        <w:t xml:space="preserve">0.5107, R² 0.2251). By date-clustered DM, the LSTM has a lower MAE than HAR-X (p&lt;0.001), the LSTM has a higher</w:t>
+      </w:r>
+      <w:r>
+        <w:t xml:space="preserve"> </w:t>
+      </w:r>
+      <w:r>
+        <w:t xml:space="preserve">QLIKE than HAR-X (p=0.028), and the LSTM+GAT has a lower QLIKE than the no-graph LSTM (p&lt;0.001).</w:t>
       </w:r>
     </w:p>
     <w:p>
@@ -5447,13 +5447,13 @@
         <w:t xml:space="preserve"> </w:t>
       </w:r>
       <w:r>
-        <w:t xml:space="preserve">HAR has the lowest MSE, RMSE, QLIKE and highest R²; the LSTM has the lowest MAE (3.090). By DM,</w:t>
-      </w:r>
-      <w:r>
-        <w:t xml:space="preserve"> </w:t>
-      </w:r>
-      <w:r>
-        <w:t xml:space="preserve">the LSTM has a lower MAE than HAR (p&lt;0.001) and the LSTM+GAT has a lower QLIKE than the LSTM (p=0.022).</w:t>
+        <w:t xml:space="preserve">HAR-X has the lowest MSE, RMSE, QLIKE and highest R²; the LSTM has the lowest MAE (3.090). By DM,</w:t>
+      </w:r>
+      <w:r>
+        <w:t xml:space="preserve"> </w:t>
+      </w:r>
+      <w:r>
+        <w:t xml:space="preserve">the LSTM has a lower MAE than HAR-X (p&lt;0.001) and the LSTM+GAT has a lower QLIKE than the LSTM (p=0.022).</w:t>
       </w:r>
     </w:p>
     <w:p>
@@ -5475,13 +5475,13 @@
         <w:t xml:space="preserve"> </w:t>
       </w:r>
       <w:r>
-        <w:t xml:space="preserve">The LSTM+GAT has the lowest MSE, RMSE, MAE and highest R²; HAR has the lowest QLIKE (0.5159). By</w:t>
-      </w:r>
-      <w:r>
-        <w:t xml:space="preserve"> </w:t>
-      </w:r>
-      <w:r>
-        <w:t xml:space="preserve">DM, the LSTM has a higher QLIKE than HAR (p&lt;0.001), and the LSTM+GAT has a lower QLIKE (p&lt;0.001) and lower</w:t>
+        <w:t xml:space="preserve">The LSTM+GAT has the lowest MSE, RMSE, MAE and highest R²; HAR-X has the lowest QLIKE (0.5159). By</w:t>
+      </w:r>
+      <w:r>
+        <w:t xml:space="preserve"> </w:t>
+      </w:r>
+      <w:r>
+        <w:t xml:space="preserve">DM, the LSTM has a higher QLIKE than HAR-X (p&lt;0.001), and the LSTM+GAT has a lower QLIKE (p&lt;0.001) and lower</w:t>
       </w:r>
       <w:r>
         <w:t xml:space="preserve"> </w:t>
@@ -5509,13 +5509,13 @@
         <w:t xml:space="preserve"> </w:t>
       </w:r>
       <w:r>
-        <w:t xml:space="preserve">HAR has the lowest value on all five metrics. By DM, the LSTM has a higher QLIKE (p=0.037) and</w:t>
-      </w:r>
-      <w:r>
-        <w:t xml:space="preserve"> </w:t>
-      </w:r>
-      <w:r>
-        <w:t xml:space="preserve">higher MAE (p&lt;0.001) than HAR, and the LSTM+GAT has a lower QLIKE than the LSTM (p=0.031).</w:t>
+        <w:t xml:space="preserve">HAR-X has the lowest value on all five metrics. By DM, the LSTM has a higher QLIKE (p=0.037) and</w:t>
+      </w:r>
+      <w:r>
+        <w:t xml:space="preserve"> </w:t>
+      </w:r>
+      <w:r>
+        <w:t xml:space="preserve">higher MAE (p&lt;0.001) than HAR-X, and the LSTM+GAT has a lower QLIKE than the LSTM (p=0.031).</w:t>
       </w:r>
     </w:p>
     <w:p>
@@ -5523,7 +5523,7 @@
         <w:pStyle w:val="FirstParagraph"/>
       </w:pPr>
       <w:r>
-        <w:t xml:space="preserve">Across the four short-horizon cells, no learned model has a significantly lower QLIKE than HAR; the LSTM+GAT</w:t>
+        <w:t xml:space="preserve">Across the four short-horizon cells, no learned model has a significantly lower QLIKE than HAR-X; the LSTM+GAT</w:t>
       </w:r>
       <w:r>
         <w:t xml:space="preserve"> </w:t>
@@ -5535,7 +5535,7 @@
         <w:t xml:space="preserve"> </w:t>
       </w:r>
       <w:r>
-        <w:t xml:space="preserve">p&lt;0.001, h5 p=0.031), and its QLIKE equals HAR’s level at VN100 h5 (0.5690 versus 0.5633) and VN100 h1 (0.5107</w:t>
+        <w:t xml:space="preserve">p&lt;0.001, h5 p=0.031), and its QLIKE equals HAR-X’s level at VN100 h5 (0.5690 versus 0.5633) and VN100 h1 (0.5107</w:t>
       </w:r>
       <w:r>
         <w:t xml:space="preserve"> </w:t>
@@ -5559,7 +5559,7 @@
         <w:t xml:space="preserve"> </w:t>
       </w:r>
       <w:r>
-        <w:t xml:space="preserve">HAR has the lowest MSE, RMSE, QLIKE and highest R² on both panels at</w:t>
+        <w:t xml:space="preserve">HAR-X has the lowest MSE, RMSE, QLIKE and highest R² on both panels at</w:t>
       </w:r>
       <w:r>
         <w:t xml:space="preserve"> </w:t>
@@ -5577,13 +5577,13 @@
         <w:t xml:space="preserve"> </w:t>
       </w:r>
       <w:r>
-        <w:t xml:space="preserve">significant at h10 or h22 on either panel (p ≥ 0.55); the LSTM has a higher squared error than HAR at VN100</w:t>
-      </w:r>
-      <w:r>
-        <w:t xml:space="preserve"> </w:t>
-      </w:r>
-      <w:r>
-        <w:t xml:space="preserve">h10 (p=0.022) and h22 (p=0.002) and a higher MAE than HAR at VN30 h22 (p=0.001).</w:t>
+        <w:t xml:space="preserve">significant at h10 or h22 on either panel (p ≥ 0.55); the LSTM has a higher squared error than HAR-X at VN100</w:t>
+      </w:r>
+      <w:r>
+        <w:t xml:space="preserve"> </w:t>
+      </w:r>
+      <w:r>
+        <w:t xml:space="preserve">h10 (p=0.022) and h22 (p=0.002) and a higher MAE than HAR-X at VN30 h22 (p=0.001).</w:t>
       </w:r>
       <w:r>
         <w:t xml:space="preserve"> </w:t>
@@ -5599,7 +5599,7 @@
         <w:t xml:space="preserve"> </w:t>
       </w:r>
       <w:r>
-        <w:t xml:space="preserve">GARCH(1,1) has a higher MSE, RMSE, MAE and QLIKE and a lower (negative) R² than HAR at every horizon on both panels; its QLIKE is higher than HAR’s under the date-clustered DM test in all eight cells (p&lt;0.001, except VN30 h22 where p=0.001).</w:t>
+        <w:t xml:space="preserve">GARCH(1,1) has a higher MSE, RMSE, MAE and QLIKE and a lower (negative) R² than HAR-X at every horizon on both panels; its QLIKE is higher than HAR-X-X’s under the date-clustered DM test in all eight cells (p&lt;0.001, except VN30 h22 where p=0.001). GARCH is a frozen-train forecast that converges to the unconditional variance, so its point error is large on VN100 where the volatility level shifts between train and test.</w:t>
       </w:r>
     </w:p>
     <w:p>
@@ -5624,19 +5624,19 @@
         <w:pStyle w:val="FirstParagraph"/>
       </w:pPr>
       <w:r>
-        <w:t xml:space="preserve">On both panels HAR has the lowest QLIKE at every horizon, and no learned model has a significantly lower QLIKE</w:t>
-      </w:r>
-      <w:r>
-        <w:t xml:space="preserve"> </w:t>
-      </w:r>
-      <w:r>
-        <w:t xml:space="preserve">than HAR under the date-clustered DM test. At h1 and h5 the LSTM and LSTM+GAT have the lowest MAE on VN100</w:t>
-      </w:r>
-      <w:r>
-        <w:t xml:space="preserve"> </w:t>
-      </w:r>
-      <w:r>
-        <w:t xml:space="preserve">(LSTM versus HAR, p&lt;0.001), and the LSTM+GAT has a significantly lower QLIKE and, on VN30, lower squared error</w:t>
+        <w:t xml:space="preserve">On both panels HAR-X has the lowest QLIKE at every horizon, and no learned model has a significantly lower QLIKE</w:t>
+      </w:r>
+      <w:r>
+        <w:t xml:space="preserve"> </w:t>
+      </w:r>
+      <w:r>
+        <w:t xml:space="preserve">than HAR-X under the date-clustered DM test. At h1 and h5 the LSTM and LSTM+GAT have the lowest MAE on VN100</w:t>
+      </w:r>
+      <w:r>
+        <w:t xml:space="preserve"> </w:t>
+      </w:r>
+      <w:r>
+        <w:t xml:space="preserve">(LSTM versus HAR-X, p&lt;0.001), and the LSTM+GAT has a significantly lower QLIKE and, on VN30, lower squared error</w:t>
       </w:r>
       <w:r>
         <w:t xml:space="preserve"> </w:t>
@@ -5648,7 +5648,7 @@
         <w:t xml:space="preserve"> </w:t>
       </w:r>
       <w:r>
-        <w:t xml:space="preserve">of the metrics. At h10 and h22 HAR has the lowest MSE, RMSE, QLIKE and R², and the LSTM+GAT-versus-LSTM QLIKE</w:t>
+        <w:t xml:space="preserve">of the metrics. At h10 and h22 HAR-X has the lowest MSE, RMSE, QLIKE and R², and the LSTM+GAT-versus-LSTM QLIKE</w:t>
       </w:r>
       <w:r>
         <w:t xml:space="preserve"> </w:t>
@@ -5672,7 +5672,7 @@
         <w:t xml:space="preserve"> </w:t>
       </w:r>
       <w:r>
-        <w:t xml:space="preserve">HAR’s.</w:t>
+        <w:t xml:space="preserve">HAR-X’s.</w:t>
       </w:r>
     </w:p>
     <w:p>
@@ -5729,13 +5729,13 @@
         <w:t xml:space="preserve"> </w:t>
       </w:r>
       <w:r>
-        <w:t xml:space="preserve">masked panel and the same date-clustered Diebold–Mariano inference, HAR has the lowest QLIKE at</w:t>
-      </w:r>
-      <w:r>
-        <w:t xml:space="preserve"> </w:t>
-      </w:r>
-      <w:r>
-        <w:t xml:space="preserve">every horizon on both panels and no learned model has a significantly lower QLIKE than HAR. At the short</w:t>
+        <w:t xml:space="preserve">masked panel and the same date-clustered Diebold–Mariano inference, HAR-X has the lowest QLIKE at</w:t>
+      </w:r>
+      <w:r>
+        <w:t xml:space="preserve"> </w:t>
+      </w:r>
+      <w:r>
+        <w:t xml:space="preserve">every horizon on both panels and no learned model has a significantly lower QLIKE than HAR-X. At the short</w:t>
       </w:r>
       <w:r>
         <w:t xml:space="preserve"> </w:t>
@@ -5753,7 +5753,7 @@
         <w:t xml:space="preserve"> </w:t>
       </w:r>
       <w:r>
-        <w:t xml:space="preserve">panels, equal to HAR’s QLIKE level at VN100 h5; at the extended horizons (h10, h22) HAR has the lowest MSE,</w:t>
+        <w:t xml:space="preserve">panels, equal to HAR-X’s QLIKE level at VN100 h5; at the extended horizons (h10, h22) HAR-X has the lowest MSE,</w:t>
       </w:r>
       <w:r>
         <w:t xml:space="preserve"> </w:t>

</xml_diff>

<commit_message>
paper (Finding A): soften 'HAR-X lowest QLIKE at every horizon' overclaim -> honest wording
External-review Finding A: the blanket claim contradicted the paper's own VN100 h1 cell (LSTM+GAT 0.5107 < HAR-X 0.5115, DM p~0.96 not significant). Now all abstract/intro/ranking/discussion/conclusion state both facts: no learned model has a significantly lower QLIKE than HAR-X at any horizon, and HAR-X has the lowest point estimate in every cell EXCEPT VN100 h1 (marginally lower, not significant). h10/h22 statements + tables unchanged.

Co-Authored-By: Claude Opus 4.8 (1M context) <noreply@anthropic.com>
</commit_message>
<xml_diff>
--- a/docs/paper/soict_paper_complete.docx
+++ b/docs/paper/soict_paper_complete.docx
@@ -136,7 +136,13 @@
         <w:t xml:space="preserve"> </w:t>
       </w:r>
       <w:r>
-        <w:t xml:space="preserve">lowest QLIKE on both panels at every horizon, and no learned model has a significantly lower QLIKE than HAR-X</w:t>
+        <w:t xml:space="preserve">lowest QLIKE at every horizon except VN100 h1 (where the LSTM+GAT point estimate is marginally lower, not</w:t>
+      </w:r>
+      <w:r>
+        <w:t xml:space="preserve"> </w:t>
+      </w:r>
+      <w:r>
+        <w:t xml:space="preserve">significantly), and no learned model has a significantly lower QLIKE than HAR-X at any horizon</w:t>
       </w:r>
       <w:r>
         <w:t xml:space="preserve"> </w:t>
@@ -366,7 +372,7 @@
         <w:t xml:space="preserve"> </w:t>
       </w:r>
       <w:r>
-        <w:t xml:space="preserve">test — HAR-X has the lowest QLIKE at every horizon with no learned model significantly lower, the deep models</w:t>
+        <w:t xml:space="preserve">test — HAR-X has the lowest QLIKE at every horizon except VN100 h1 (not significantly), with no learned model significantly lower at any horizon, the deep models</w:t>
       </w:r>
       <w:r>
         <w:t xml:space="preserve"> </w:t>
@@ -5624,13 +5630,19 @@
         <w:pStyle w:val="FirstParagraph"/>
       </w:pPr>
       <w:r>
-        <w:t xml:space="preserve">On both panels HAR-X has the lowest QLIKE at every horizon, and no learned model has a significantly lower QLIKE</w:t>
-      </w:r>
-      <w:r>
-        <w:t xml:space="preserve"> </w:t>
-      </w:r>
-      <w:r>
-        <w:t xml:space="preserve">than HAR-X under the date-clustered DM test. At h1 and h5 the LSTM and LSTM+GAT have the lowest MAE on VN100</w:t>
+        <w:t xml:space="preserve">No learned model has a significantly lower QLIKE than HAR-X at any horizon under the date-clustered DM test;</w:t>
+      </w:r>
+      <w:r>
+        <w:t xml:space="preserve"> </w:t>
+      </w:r>
+      <w:r>
+        <w:t xml:space="preserve">HAR-X has the lowest point estimate in every cell except VN100 h1, where the LSTM+GAT is marginally lower</w:t>
+      </w:r>
+      <w:r>
+        <w:t xml:space="preserve"> </w:t>
+      </w:r>
+      <w:r>
+        <w:t xml:space="preserve">(not significant). At h1 and h5 the LSTM and LSTM+GAT have the lowest MAE on VN100</w:t>
       </w:r>
       <w:r>
         <w:t xml:space="preserve"> </w:t>
@@ -5729,13 +5741,19 @@
         <w:t xml:space="preserve"> </w:t>
       </w:r>
       <w:r>
-        <w:t xml:space="preserve">masked panel and the same date-clustered Diebold–Mariano inference, HAR-X has the lowest QLIKE at</w:t>
-      </w:r>
-      <w:r>
-        <w:t xml:space="preserve"> </w:t>
-      </w:r>
-      <w:r>
-        <w:t xml:space="preserve">every horizon on both panels and no learned model has a significantly lower QLIKE than HAR-X. At the short</w:t>
+        <w:t xml:space="preserve">masked panel and the same date-clustered Diebold–Mariano inference, no learned model has a significantly lower</w:t>
+      </w:r>
+      <w:r>
+        <w:t xml:space="preserve"> </w:t>
+      </w:r>
+      <w:r>
+        <w:t xml:space="preserve">QLIKE than HAR-X at any horizon, and HAR-X has the lowest QLIKE point estimate in every cell except VN100 h1,</w:t>
+      </w:r>
+      <w:r>
+        <w:t xml:space="preserve"> </w:t>
+      </w:r>
+      <w:r>
+        <w:t xml:space="preserve">where the LSTM+GAT is marginally lower (not significant). At the short</w:t>
       </w:r>
       <w:r>
         <w:t xml:space="preserve"> </w:t>

</xml_diff>